<commit_message>
docs: record compose smoke evidence
</commit_message>
<xml_diff>
--- a/docs/WEMOVE产品门户测试报告.docx
+++ b/docs/WEMOVE产品门户测试报告.docx
@@ -702,7 +702,7 @@
                 <w:color w:val="000000"/>
                 <w:sz w:val="18"/>
               </w:rPr>
-              <w:t>Compose 配置</w:t>
+              <w:t>Compose 部署</w:t>
             </w:r>
           </w:p>
         </w:tc>
@@ -730,7 +730,7 @@
                 <w:color w:val="000000"/>
                 <w:sz w:val="18"/>
               </w:rPr>
-              <w:t>production 与 local override</w:t>
+              <w:t>新卷启动 健康 API MySQL 重启持久化</w:t>
             </w:r>
           </w:p>
         </w:tc>
@@ -786,7 +786,7 @@
                 <w:color w:val="000000"/>
                 <w:sz w:val="18"/>
               </w:rPr>
-              <w:t>docker compose config</w:t>
+              <w:t>GitHub Actions 34251828508</w:t>
             </w:r>
           </w:p>
         </w:tc>
@@ -904,7 +904,7 @@
                 <w:color w:val="000000"/>
                 <w:sz w:val="18"/>
               </w:rPr>
-              <w:t>GitHub Actions 34249949870</w:t>
+              <w:t>GitHub Actions 34251828508</w:t>
             </w:r>
           </w:p>
         </w:tc>
@@ -1018,7 +1018,7 @@
                 <w:color w:val="000000"/>
                 <w:sz w:val="18"/>
               </w:rPr>
-              <w:t>GitHub Actions 34249949870</w:t>
+              <w:t>GitHub Actions 34251828508</w:t>
             </w:r>
           </w:p>
         </w:tc>
@@ -1604,7 +1604,7 @@
                 <w:color w:val="000000"/>
                 <w:sz w:val="17"/>
               </w:rPr>
-              <w:t>待执行</w:t>
+              <w:t>通过</w:t>
             </w:r>
           </w:p>
         </w:tc>
@@ -1783,7 +1783,7 @@
                 <w:color w:val="000000"/>
                 <w:sz w:val="17"/>
               </w:rPr>
-              <w:t>待执行</w:t>
+              <w:t>通过</w:t>
             </w:r>
           </w:p>
         </w:tc>
@@ -2150,7 +2150,7 @@
           <w:color w:val="776D61"/>
           <w:sz w:val="17"/>
         </w:rPr>
-        <w:t>证据类型：e2e/手工；手工/API；部署冒烟；部署演练</w:t>
+        <w:t>证据类型：CI 部署冒烟；Compose/API；e2e/手工；部署演练</w:t>
       </w:r>
     </w:p>
     <w:p>

</xml_diff>

<commit_message>
feat: rebuild dealer and admin workspaces
</commit_message>
<xml_diff>
--- a/docs/WEMOVE产品门户测试报告.docx
+++ b/docs/WEMOVE产品门户测试报告.docx
@@ -9,6 +9,9 @@
         <w:jc w:val="center"/>
       </w:pPr>
       <w:r>
+        <w:rPr>
+          <w:rFonts w:eastAsia="Microsoft YaHei"/>
+        </w:rPr>
         <w:t>WEMOVE 产品门户测试报告</w:t>
       </w:r>
     </w:p>
@@ -18,7 +21,7 @@
       </w:pPr>
       <w:r>
         <w:rPr>
-          <w:rFonts w:ascii="Microsoft YaHei" w:hAnsi="Microsoft YaHei" w:eastAsia="微软雅黑"/>
+          <w:rFonts w:ascii="Microsoft YaHei" w:hAnsi="Microsoft YaHei" w:eastAsia="Microsoft YaHei"/>
           <w:sz w:val="30"/>
         </w:rPr>
         <w:t>软件开发实践 2 课程项目</w:t>
@@ -30,18 +33,15 @@
         <w:jc w:val="center"/>
       </w:pPr>
       <w:r>
-        <w:t>测试范围  MVP01 至 MVP07</w:t>
+        <w:rPr>
+          <w:rFonts w:eastAsia="Microsoft YaHei"/>
+        </w:rPr>
+        <w:t>测试范围  MVP01 至 MVP08（含经销商中心与管理后台重构）</w:t>
         <w:br/>
-      </w:r>
-      <w:r>
-        <w:t>版本分支  fix/mvp05-mvp07-integration</w:t>
+        <w:t>版本分支  feat/dealer-admin-redesign</w:t>
         <w:br/>
-      </w:r>
-      <w:r>
         <w:t>编制日期  2026 年 9 月 9 日</w:t>
         <w:br/>
-      </w:r>
-      <w:r>
         <w:t>项目仓库  wemove-course-team/wemove-product-portal</w:t>
       </w:r>
     </w:p>
@@ -50,11 +50,17 @@
         <w:spacing w:before="1120"/>
       </w:pPr>
       <w:r>
-        <w:t>本报告面向课程验收，覆盖功能正确性、权限安全、数据持久化、响应式界面和部署可复现性。当前本地单元测试与前后端构建已通过；真实 MySQL 端到端结果以集成 PR 的 GitHub Actions 为最终依据。</w:t>
+        <w:rPr>
+          <w:rFonts w:eastAsia="Microsoft YaHei"/>
+        </w:rPr>
+        <w:t>本报告面向课程验收，覆盖功能正确性、角色与企业数据边界、业务状态机、数据持久化、响应式界面和部署可复现性。当前本地单元测试、真实 MySQL 端到端测试、前后端生产构建、Docker 镜像和 Compose 健康检查均已通过；当前分支仍需以推送后的 GitHub Actions 结果作为最终发布依据。</w:t>
       </w:r>
     </w:p>
     <w:p>
       <w:r>
+        <w:rPr>
+          <w:rFonts w:eastAsia="Microsoft YaHei"/>
+        </w:rPr>
         <w:br w:type="page"/>
       </w:r>
     </w:p>
@@ -63,12 +69,18 @@
         <w:pStyle w:val="Heading1"/>
       </w:pPr>
       <w:r>
+        <w:rPr>
+          <w:rFonts w:eastAsia="Microsoft YaHei"/>
+        </w:rPr>
         <w:t>1 测试结论</w:t>
       </w:r>
     </w:p>
     <w:p>
       <w:r>
-        <w:t>本轮已将 MVP05 与 MVP07 集成到同一代码线，并补齐站点配置、首页 Banner、后台真实统计、用户管理和完整数据库迁移链。发布门槛是后端单元测试、真实 MySQL e2e、前端测试、前后端构建、Docker 镜像构建和关键人工冒烟全部通过。</w:t>
+        <w:rPr>
+          <w:rFonts w:eastAsia="Microsoft YaHei"/>
+        </w:rPr>
+        <w:t>本轮完成 UTF-8 历史数据修复，并按网站重构需求补齐经销商独立工作台、授权目录、询价、快捷下单、订单与物流、发票、企业成员和地址，以及管理端报价回复和订单状态流转。所有业务数字来自真实接口，非法状态、越权和危险操作由前后端共同约束。</w:t>
       </w:r>
     </w:p>
     <w:tbl>
@@ -255,18 +267,14 @@
           </w:tcPr>
           <w:p>
             <w:pPr>
-              <w:spacing w:after="0" w:line="259" w:lineRule="auto"/>
-              <w:jc w:val="left"/>
-            </w:pPr>
-            <w:r/>
-            <w:r>
-              <w:rPr>
-                <w:rFonts w:ascii="Microsoft YaHei" w:hAnsi="Microsoft YaHei" w:eastAsia="微软雅黑"/>
-                <w:b w:val="0"/>
-                <w:color w:val="000000"/>
-                <w:sz w:val="18"/>
-              </w:rPr>
-              <w:t>9 个套件 85 个用例</w:t>
+              <w:spacing w:before="0" w:after="0" w:line="269" w:lineRule="auto"/>
+            </w:pPr>
+            <w:r>
+              <w:rPr>
+                <w:rFonts w:ascii="Aptos" w:hAnsi="Aptos" w:eastAsia="Microsoft YaHei"/>
+                <w:sz w:val="17"/>
+              </w:rPr>
+              <w:t>9 个套件 86 个用例</w:t>
             </w:r>
           </w:p>
         </w:tc>
@@ -371,18 +379,14 @@
           </w:tcPr>
           <w:p>
             <w:pPr>
-              <w:spacing w:after="0" w:line="259" w:lineRule="auto"/>
-              <w:jc w:val="left"/>
-            </w:pPr>
-            <w:r/>
-            <w:r>
-              <w:rPr>
-                <w:rFonts w:ascii="Microsoft YaHei" w:hAnsi="Microsoft YaHei" w:eastAsia="微软雅黑"/>
-                <w:b w:val="0"/>
-                <w:color w:val="000000"/>
-                <w:sz w:val="18"/>
-              </w:rPr>
-              <w:t>6 个用例</w:t>
+              <w:spacing w:before="0" w:after="0" w:line="269" w:lineRule="auto"/>
+            </w:pPr>
+            <w:r>
+              <w:rPr>
+                <w:rFonts w:ascii="Aptos" w:hAnsi="Aptos" w:eastAsia="Microsoft YaHei"/>
+                <w:sz w:val="17"/>
+              </w:rPr>
+              <w:t>8 个用例</w:t>
             </w:r>
           </w:p>
         </w:tc>
@@ -719,18 +723,14 @@
           </w:tcPr>
           <w:p>
             <w:pPr>
-              <w:spacing w:after="0" w:line="259" w:lineRule="auto"/>
-              <w:jc w:val="left"/>
-            </w:pPr>
-            <w:r/>
-            <w:r>
-              <w:rPr>
-                <w:rFonts w:ascii="Microsoft YaHei" w:hAnsi="Microsoft YaHei" w:eastAsia="微软雅黑"/>
-                <w:b w:val="0"/>
-                <w:color w:val="000000"/>
-                <w:sz w:val="18"/>
-              </w:rPr>
-              <w:t>新卷启动 健康 API MySQL 重启持久化</w:t>
+              <w:spacing w:before="0" w:after="0" w:line="269" w:lineRule="auto"/>
+            </w:pPr>
+            <w:r>
+              <w:rPr>
+                <w:rFonts w:ascii="Aptos" w:hAnsi="Aptos" w:eastAsia="Microsoft YaHei"/>
+                <w:sz w:val="17"/>
+              </w:rPr>
+              <w:t>MVP08 新卷初始化 健康 API MySQL 持久化</w:t>
             </w:r>
           </w:p>
         </w:tc>
@@ -775,18 +775,14 @@
           </w:tcPr>
           <w:p>
             <w:pPr>
-              <w:spacing w:after="0" w:line="259" w:lineRule="auto"/>
-              <w:jc w:val="left"/>
-            </w:pPr>
-            <w:r/>
-            <w:r>
-              <w:rPr>
-                <w:rFonts w:ascii="Microsoft YaHei" w:hAnsi="Microsoft YaHei" w:eastAsia="微软雅黑"/>
-                <w:b w:val="0"/>
-                <w:color w:val="000000"/>
-                <w:sz w:val="18"/>
-              </w:rPr>
-              <w:t>GitHub Actions 34251828508</w:t>
+              <w:spacing w:before="0" w:after="0" w:line="269" w:lineRule="auto"/>
+            </w:pPr>
+            <w:r>
+              <w:rPr>
+                <w:rFonts w:ascii="Aptos" w:hAnsi="Aptos" w:eastAsia="Microsoft YaHei"/>
+                <w:sz w:val="17"/>
+              </w:rPr>
+              <w:t>本地 Compose；CI 待运行</w:t>
             </w:r>
           </w:p>
         </w:tc>
@@ -835,18 +831,14 @@
           </w:tcPr>
           <w:p>
             <w:pPr>
-              <w:spacing w:after="0" w:line="259" w:lineRule="auto"/>
-              <w:jc w:val="left"/>
-            </w:pPr>
-            <w:r/>
-            <w:r>
-              <w:rPr>
-                <w:rFonts w:ascii="Microsoft YaHei" w:hAnsi="Microsoft YaHei" w:eastAsia="微软雅黑"/>
-                <w:b w:val="0"/>
-                <w:color w:val="000000"/>
-                <w:sz w:val="18"/>
-              </w:rPr>
-              <w:t>6 个套件 80 个用例</w:t>
+              <w:spacing w:before="0" w:after="0" w:line="269" w:lineRule="auto"/>
+            </w:pPr>
+            <w:r>
+              <w:rPr>
+                <w:rFonts w:ascii="Aptos" w:hAnsi="Aptos" w:eastAsia="Microsoft YaHei"/>
+                <w:sz w:val="17"/>
+              </w:rPr>
+              <w:t>6 个套件 86 个用例</w:t>
             </w:r>
           </w:p>
         </w:tc>
@@ -893,18 +885,14 @@
           </w:tcPr>
           <w:p>
             <w:pPr>
-              <w:spacing w:after="0" w:line="259" w:lineRule="auto"/>
-              <w:jc w:val="left"/>
-            </w:pPr>
-            <w:r/>
-            <w:r>
-              <w:rPr>
-                <w:rFonts w:ascii="Microsoft YaHei" w:hAnsi="Microsoft YaHei" w:eastAsia="微软雅黑"/>
-                <w:b w:val="0"/>
-                <w:color w:val="000000"/>
-                <w:sz w:val="18"/>
-              </w:rPr>
-              <w:t>GitHub Actions 34251828508</w:t>
+              <w:spacing w:before="0" w:after="0" w:line="269" w:lineRule="auto"/>
+            </w:pPr>
+            <w:r>
+              <w:rPr>
+                <w:rFonts w:ascii="Aptos" w:hAnsi="Aptos" w:eastAsia="Microsoft YaHei"/>
+                <w:sz w:val="17"/>
+              </w:rPr>
+              <w:t>本地 MySQL 8</w:t>
             </w:r>
           </w:p>
         </w:tc>
@@ -1007,18 +995,14 @@
           </w:tcPr>
           <w:p>
             <w:pPr>
-              <w:spacing w:after="0" w:line="259" w:lineRule="auto"/>
-              <w:jc w:val="left"/>
-            </w:pPr>
-            <w:r/>
-            <w:r>
-              <w:rPr>
-                <w:rFonts w:ascii="Microsoft YaHei" w:hAnsi="Microsoft YaHei" w:eastAsia="微软雅黑"/>
-                <w:b w:val="0"/>
-                <w:color w:val="000000"/>
-                <w:sz w:val="18"/>
-              </w:rPr>
-              <w:t>GitHub Actions 34251828508</w:t>
+              <w:spacing w:before="0" w:after="0" w:line="269" w:lineRule="auto"/>
+            </w:pPr>
+            <w:r>
+              <w:rPr>
+                <w:rFonts w:ascii="Aptos" w:hAnsi="Aptos" w:eastAsia="Microsoft YaHei"/>
+                <w:sz w:val="17"/>
+              </w:rPr>
+              <w:t>本地构建通过；CI 待运行</w:t>
             </w:r>
           </w:p>
         </w:tc>
@@ -1067,18 +1051,14 @@
           </w:tcPr>
           <w:p>
             <w:pPr>
-              <w:spacing w:after="0" w:line="259" w:lineRule="auto"/>
-              <w:jc w:val="left"/>
-            </w:pPr>
-            <w:r/>
-            <w:r>
-              <w:rPr>
-                <w:rFonts w:ascii="Microsoft YaHei" w:hAnsi="Microsoft YaHei" w:eastAsia="微软雅黑"/>
-                <w:b w:val="0"/>
-                <w:color w:val="000000"/>
-                <w:sz w:val="18"/>
-              </w:rPr>
-              <w:t>375 768 1280 三档</w:t>
+              <w:spacing w:before="0" w:after="0" w:line="269" w:lineRule="auto"/>
+            </w:pPr>
+            <w:r>
+              <w:rPr>
+                <w:rFonts w:ascii="Aptos" w:hAnsi="Aptos" w:eastAsia="Microsoft YaHei"/>
+                <w:sz w:val="17"/>
+              </w:rPr>
+              <w:t>390px 与桌面；768px 待现场</w:t>
             </w:r>
           </w:p>
         </w:tc>
@@ -1096,18 +1076,14 @@
           </w:tcPr>
           <w:p>
             <w:pPr>
-              <w:spacing w:after="0" w:line="259" w:lineRule="auto"/>
-              <w:jc w:val="center"/>
-            </w:pPr>
-            <w:r/>
-            <w:r>
-              <w:rPr>
-                <w:rFonts w:ascii="Microsoft YaHei" w:hAnsi="Microsoft YaHei" w:eastAsia="微软雅黑"/>
-                <w:b w:val="0"/>
-                <w:color w:val="000000"/>
-                <w:sz w:val="18"/>
-              </w:rPr>
-              <w:t>待执行</w:t>
+              <w:spacing w:before="0" w:after="0" w:line="269" w:lineRule="auto"/>
+            </w:pPr>
+            <w:r>
+              <w:rPr>
+                <w:rFonts w:ascii="Aptos" w:hAnsi="Aptos" w:eastAsia="Microsoft YaHei"/>
+                <w:sz w:val="17"/>
+              </w:rPr>
+              <w:t>部分通过</w:t>
             </w:r>
           </w:p>
         </w:tc>
@@ -1125,18 +1101,14 @@
           </w:tcPr>
           <w:p>
             <w:pPr>
-              <w:spacing w:after="0" w:line="259" w:lineRule="auto"/>
-              <w:jc w:val="left"/>
-            </w:pPr>
-            <w:r/>
-            <w:r>
-              <w:rPr>
-                <w:rFonts w:ascii="Microsoft YaHei" w:hAnsi="Microsoft YaHei" w:eastAsia="微软雅黑"/>
-                <w:b w:val="0"/>
-                <w:color w:val="000000"/>
-                <w:sz w:val="18"/>
-              </w:rPr>
-              <w:t>见第 5 节</w:t>
+              <w:spacing w:before="0" w:after="0" w:line="269" w:lineRule="auto"/>
+            </w:pPr>
+            <w:r>
+              <w:rPr>
+                <w:rFonts w:ascii="Aptos" w:hAnsi="Aptos" w:eastAsia="Microsoft YaHei"/>
+                <w:sz w:val="17"/>
+              </w:rPr>
+              <w:t>浏览器人工</w:t>
             </w:r>
           </w:p>
         </w:tc>
@@ -1147,22 +1119,34 @@
         <w:pStyle w:val="Heading1"/>
       </w:pPr>
       <w:r>
+        <w:rPr>
+          <w:rFonts w:eastAsia="Microsoft YaHei"/>
+        </w:rPr>
         <w:t>2 测试环境与方法</w:t>
       </w:r>
     </w:p>
     <w:p>
       <w:r>
+        <w:rPr>
+          <w:rFonts w:eastAsia="Microsoft YaHei"/>
+        </w:rPr>
         <w:t>应用架构：Vue 3 与 Element Plus 前端，NestJS 与 TypeORM 后端，MySQL 8 数据库，Nginx 同源代理。</w:t>
       </w:r>
     </w:p>
     <w:p>
       <w:r>
-        <w:t>本地环境：Windows 11、Node.js 20 兼容运行时、Docker Desktop 29.4.3。Docker Hub 在本次执行中出现授权端点 EOF，因此本地未下载新的 MySQL 镜像。</w:t>
+        <w:rPr>
+          <w:rFonts w:eastAsia="Microsoft YaHei"/>
+        </w:rPr>
+        <w:t>本地环境：Windows 11、Node.js 20 兼容运行时、Docker Desktop。MySQL、backend、frontend 三个容器均通过健康检查，验收入口为 http://localhost:8080。</w:t>
       </w:r>
     </w:p>
     <w:p>
       <w:r>
-        <w:t>远端环境：GitHub Actions Ubuntu runner、MySQL 8 service、Node.js 20；该环境负责最终真实数据库 e2e 与镜像构建。</w:t>
+        <w:rPr>
+          <w:rFonts w:eastAsia="Microsoft YaHei"/>
+        </w:rPr>
+        <w:t>远端环境：GitHub Actions Ubuntu runner、MySQL 8 service、Node.js 20；当前功能分支待推送后执行最终 CI。</w:t>
       </w:r>
     </w:p>
     <w:p>
@@ -1170,6 +1154,9 @@
         <w:pStyle w:val="Heading2"/>
       </w:pPr>
       <w:r>
+        <w:rPr>
+          <w:rFonts w:eastAsia="Microsoft YaHei"/>
+        </w:rPr>
         <w:t>2.1 测试层次</w:t>
       </w:r>
     </w:p>
@@ -1178,6 +1165,9 @@
         <w:pStyle w:val="ListBullet"/>
       </w:pPr>
       <w:r>
+        <w:rPr>
+          <w:rFonts w:eastAsia="Microsoft YaHei"/>
+        </w:rPr>
         <w:t>单元测试：验证领域规则、状态机、事务回滚、DTO 和前端纯函数。</w:t>
       </w:r>
     </w:p>
@@ -1186,6 +1176,9 @@
         <w:pStyle w:val="ListBullet"/>
       </w:pPr>
       <w:r>
+        <w:rPr>
+          <w:rFonts w:eastAsia="Microsoft YaHei"/>
+        </w:rPr>
         <w:t>端到端测试：在独立 wemove_portal_test 库执行真实迁移和 seed，经 HTTP 验证 Cookie、CSRF、角色和持久化。</w:t>
       </w:r>
     </w:p>
@@ -1194,6 +1187,9 @@
         <w:pStyle w:val="ListBullet"/>
       </w:pPr>
       <w:r>
+        <w:rPr>
+          <w:rFonts w:eastAsia="Microsoft YaHei"/>
+        </w:rPr>
         <w:t>构建测试：执行 NestJS 和 Vite 生产构建，确认依赖、类型与代码分割。</w:t>
       </w:r>
     </w:p>
@@ -1202,6 +1198,9 @@
         <w:pStyle w:val="ListBullet"/>
       </w:pPr>
       <w:r>
+        <w:rPr>
+          <w:rFonts w:eastAsia="Microsoft YaHei"/>
+        </w:rPr>
         <w:t>部署测试：校验 Compose、全新数据卷、健康检查、重启持久化、旧卷升级和镜像回滚。</w:t>
       </w:r>
     </w:p>
@@ -1210,6 +1209,9 @@
         <w:pStyle w:val="ListBullet"/>
       </w:pPr>
       <w:r>
+        <w:rPr>
+          <w:rFonts w:eastAsia="Microsoft YaHei"/>
+        </w:rPr>
         <w:t>人工验收：按项目功能需求完成前台、账户、后台与经销商完整业务路径，并检查三档响应式。</w:t>
       </w:r>
     </w:p>
@@ -1218,11 +1220,17 @@
         <w:pStyle w:val="Heading1"/>
       </w:pPr>
       <w:r>
+        <w:rPr>
+          <w:rFonts w:eastAsia="Microsoft YaHei"/>
+        </w:rPr>
         <w:t>3 测试用例</w:t>
       </w:r>
     </w:p>
     <w:p>
       <w:r>
+        <w:rPr>
+          <w:rFonts w:eastAsia="Microsoft YaHei"/>
+        </w:rPr>
         <w:t>测试用例以项目功能需求为主，P0 为课程演示和发布必过项，P1 为重要质量项。自动化用例在 CI 中执行，人工用例按第 5 节清单记录截图和实际结果。</w:t>
       </w:r>
     </w:p>
@@ -1231,6 +1239,9 @@
         <w:pStyle w:val="Heading2"/>
       </w:pPr>
       <w:r>
+        <w:rPr>
+          <w:rFonts w:eastAsia="Microsoft YaHei"/>
+        </w:rPr>
         <w:t>环境部署</w:t>
       </w:r>
     </w:p>
@@ -1743,18 +1754,14 @@
           </w:tcPr>
           <w:p>
             <w:pPr>
-              <w:spacing w:after="0" w:line="259" w:lineRule="auto"/>
-              <w:jc w:val="left"/>
-            </w:pPr>
-            <w:r/>
-            <w:r>
-              <w:rPr>
-                <w:rFonts w:ascii="Microsoft YaHei" w:hAnsi="Microsoft YaHei" w:eastAsia="微软雅黑"/>
-                <w:b w:val="0"/>
-                <w:color w:val="000000"/>
+              <w:spacing w:before="0" w:after="0" w:line="269" w:lineRule="auto"/>
+            </w:pPr>
+            <w:r>
+              <w:rPr>
+                <w:rFonts w:ascii="Aptos" w:hAnsi="Aptos" w:eastAsia="Microsoft YaHei"/>
                 <w:sz w:val="17"/>
               </w:rPr>
-              <w:t>MVP01/03/04/05/06/07 迁移和 seed 按顺序成功，三个容器 healthy。</w:t>
+              <w:t>MVP01/03/04/05/06/07/08 迁移和 seed 按顺序成功，三个容器 healthy。</w:t>
             </w:r>
           </w:p>
         </w:tc>
@@ -2147,6 +2154,7 @@
       </w:pPr>
       <w:r>
         <w:rPr>
+          <w:rFonts w:eastAsia="Microsoft YaHei"/>
           <w:color w:val="776D61"/>
           <w:sz w:val="17"/>
         </w:rPr>
@@ -2158,6 +2166,9 @@
         <w:pStyle w:val="Heading2"/>
       </w:pPr>
       <w:r>
+        <w:rPr>
+          <w:rFonts w:eastAsia="Microsoft YaHei"/>
+        </w:rPr>
         <w:t>身份用户</w:t>
       </w:r>
     </w:p>
@@ -3778,6 +3789,7 @@
       </w:pPr>
       <w:r>
         <w:rPr>
+          <w:rFonts w:eastAsia="Microsoft YaHei"/>
           <w:color w:val="776D61"/>
           <w:sz w:val="17"/>
         </w:rPr>
@@ -3789,6 +3801,9 @@
         <w:pStyle w:val="Heading2"/>
       </w:pPr>
       <w:r>
+        <w:rPr>
+          <w:rFonts w:eastAsia="Microsoft YaHei"/>
+        </w:rPr>
         <w:t>产品目录</w:t>
       </w:r>
     </w:p>
@@ -5050,6 +5065,147 @@
           </w:p>
         </w:tc>
       </w:tr>
+      <w:tr>
+        <w:trPr>
+          <w:cantSplit w:val="true"/>
+        </w:trPr>
+        <w:tc>
+          <w:tcPr>
+            <w:tcW w:type="dxa" w:w="1036"/>
+            <w:vAlign w:val="center"/>
+            <w:tcMar>
+              <w:top w:w="75" w:type="dxa"/>
+              <w:start w:w="80" w:type="dxa"/>
+              <w:bottom w:w="75" w:type="dxa"/>
+              <w:end w:w="80" w:type="dxa"/>
+            </w:tcMar>
+            <w:shd w:fill="F4F7FC"/>
+          </w:tcPr>
+          <w:p>
+            <w:pPr>
+              <w:spacing w:before="0" w:after="0" w:line="269" w:lineRule="auto"/>
+              <w:jc w:val="center"/>
+            </w:pPr>
+            <w:r>
+              <w:t>CAT-007</w:t>
+            </w:r>
+          </w:p>
+        </w:tc>
+        <w:tc>
+          <w:tcPr>
+            <w:tcW w:type="dxa" w:w="1368"/>
+            <w:vAlign w:val="center"/>
+            <w:tcMar>
+              <w:top w:w="75" w:type="dxa"/>
+              <w:start w:w="80" w:type="dxa"/>
+              <w:bottom w:w="75" w:type="dxa"/>
+              <w:end w:w="80" w:type="dxa"/>
+            </w:tcMar>
+            <w:shd w:fill="F4F7FC"/>
+          </w:tcPr>
+          <w:p>
+            <w:pPr>
+              <w:spacing w:before="0" w:after="0" w:line="269" w:lineRule="auto"/>
+              <w:jc w:val="center"/>
+            </w:pPr>
+            <w:r>
+              <w:rPr>
+                <w:b/>
+                <w:color w:val="A6311B"/>
+              </w:rPr>
+              <w:t>P0</w:t>
+            </w:r>
+          </w:p>
+        </w:tc>
+        <w:tc>
+          <w:tcPr>
+            <w:tcW w:type="dxa" w:w="1800"/>
+            <w:vAlign w:val="center"/>
+            <w:tcMar>
+              <w:top w:w="75" w:type="dxa"/>
+              <w:start w:w="80" w:type="dxa"/>
+              <w:bottom w:w="75" w:type="dxa"/>
+              <w:end w:w="80" w:type="dxa"/>
+            </w:tcMar>
+            <w:shd w:fill="F4F7FC"/>
+          </w:tcPr>
+          <w:p>
+            <w:pPr>
+              <w:spacing w:before="0" w:after="0" w:line="269" w:lineRule="auto"/>
+              <w:jc w:val="left"/>
+            </w:pPr>
+            <w:r>
+              <w:t>管理端价格与 MOQ 约束</w:t>
+            </w:r>
+          </w:p>
+        </w:tc>
+        <w:tc>
+          <w:tcPr>
+            <w:tcW w:type="dxa" w:w="2664"/>
+            <w:vAlign w:val="center"/>
+            <w:tcMar>
+              <w:top w:w="75" w:type="dxa"/>
+              <w:start w:w="80" w:type="dxa"/>
+              <w:bottom w:w="75" w:type="dxa"/>
+              <w:end w:w="80" w:type="dxa"/>
+            </w:tcMar>
+            <w:shd w:fill="F4F7FC"/>
+          </w:tcPr>
+          <w:p>
+            <w:pPr>
+              <w:spacing w:before="0" w:after="0" w:line="269" w:lineRule="auto"/>
+              <w:jc w:val="left"/>
+            </w:pPr>
+            <w:r>
+              <w:t>提交零值、超范围价格、经销商价高于零售价或非法 MOQ。</w:t>
+            </w:r>
+          </w:p>
+        </w:tc>
+        <w:tc>
+          <w:tcPr>
+            <w:tcW w:type="dxa" w:w="2664"/>
+            <w:vAlign w:val="center"/>
+            <w:tcMar>
+              <w:top w:w="75" w:type="dxa"/>
+              <w:start w:w="80" w:type="dxa"/>
+              <w:bottom w:w="75" w:type="dxa"/>
+              <w:end w:w="80" w:type="dxa"/>
+            </w:tcMar>
+            <w:shd w:fill="F4F7FC"/>
+          </w:tcPr>
+          <w:p>
+            <w:pPr>
+              <w:spacing w:before="0" w:after="0" w:line="269" w:lineRule="auto"/>
+              <w:jc w:val="left"/>
+            </w:pPr>
+            <w:r>
+              <w:t>前后端均拒绝；错误指向对应字段，原商品不变。</w:t>
+            </w:r>
+          </w:p>
+        </w:tc>
+        <w:tc>
+          <w:tcPr>
+            <w:tcW w:type="dxa" w:w="936"/>
+            <w:vAlign w:val="center"/>
+            <w:tcMar>
+              <w:top w:w="75" w:type="dxa"/>
+              <w:start w:w="80" w:type="dxa"/>
+              <w:bottom w:w="75" w:type="dxa"/>
+              <w:end w:w="80" w:type="dxa"/>
+            </w:tcMar>
+            <w:shd w:fill="F4F7FC"/>
+          </w:tcPr>
+          <w:p>
+            <w:pPr>
+              <w:spacing w:before="0" w:after="0" w:line="269" w:lineRule="auto"/>
+              <w:jc w:val="center"/>
+            </w:pPr>
+            <w:r>
+              <w:t>通过</w:t>
+            </w:r>
+          </w:p>
+        </w:tc>
+      </w:tr>
     </w:tbl>
     <w:p>
       <w:pPr>
@@ -5057,6 +5213,7 @@
       </w:pPr>
       <w:r>
         <w:rPr>
+          <w:rFonts w:eastAsia="Microsoft YaHei"/>
           <w:color w:val="776D61"/>
           <w:sz w:val="17"/>
         </w:rPr>
@@ -5068,6 +5225,9 @@
         <w:pStyle w:val="Heading2"/>
       </w:pPr>
       <w:r>
+        <w:rPr>
+          <w:rFonts w:eastAsia="Microsoft YaHei"/>
+        </w:rPr>
         <w:t>内容 CMS</w:t>
       </w:r>
     </w:p>
@@ -6157,6 +6317,7 @@
       </w:pPr>
       <w:r>
         <w:rPr>
+          <w:rFonts w:eastAsia="Microsoft YaHei"/>
           <w:color w:val="776D61"/>
           <w:sz w:val="17"/>
         </w:rPr>
@@ -6168,6 +6329,9 @@
         <w:pStyle w:val="Heading2"/>
       </w:pPr>
       <w:r>
+        <w:rPr>
+          <w:rFonts w:eastAsia="Microsoft YaHei"/>
+        </w:rPr>
         <w:t>支持中心</w:t>
       </w:r>
     </w:p>
@@ -7788,6 +7952,7 @@
       </w:pPr>
       <w:r>
         <w:rPr>
+          <w:rFonts w:eastAsia="Microsoft YaHei"/>
           <w:color w:val="776D61"/>
           <w:sz w:val="17"/>
         </w:rPr>
@@ -7799,7 +7964,10 @@
         <w:pStyle w:val="Heading2"/>
       </w:pPr>
       <w:r>
-        <w:t>经销商</w:t>
+        <w:rPr>
+          <w:rFonts w:eastAsia="Microsoft YaHei"/>
+        </w:rPr>
+        <w:t>经销商中心</w:t>
       </w:r>
     </w:p>
     <w:tbl>
@@ -9060,6 +9228,1126 @@
           </w:p>
         </w:tc>
       </w:tr>
+      <w:tr>
+        <w:trPr>
+          <w:cantSplit w:val="true"/>
+        </w:trPr>
+        <w:tc>
+          <w:tcPr>
+            <w:tcW w:type="dxa" w:w="1036"/>
+            <w:vAlign w:val="center"/>
+            <w:tcMar>
+              <w:top w:w="75" w:type="dxa"/>
+              <w:start w:w="80" w:type="dxa"/>
+              <w:bottom w:w="75" w:type="dxa"/>
+              <w:end w:w="80" w:type="dxa"/>
+            </w:tcMar>
+            <w:shd w:fill="F4F7FC"/>
+          </w:tcPr>
+          <w:p>
+            <w:pPr>
+              <w:spacing w:before="0" w:after="0" w:line="269" w:lineRule="auto"/>
+              <w:jc w:val="center"/>
+            </w:pPr>
+            <w:r>
+              <w:t>DEA-007</w:t>
+            </w:r>
+          </w:p>
+        </w:tc>
+        <w:tc>
+          <w:tcPr>
+            <w:tcW w:type="dxa" w:w="1368"/>
+            <w:vAlign w:val="center"/>
+            <w:tcMar>
+              <w:top w:w="75" w:type="dxa"/>
+              <w:start w:w="80" w:type="dxa"/>
+              <w:bottom w:w="75" w:type="dxa"/>
+              <w:end w:w="80" w:type="dxa"/>
+            </w:tcMar>
+            <w:shd w:fill="F4F7FC"/>
+          </w:tcPr>
+          <w:p>
+            <w:pPr>
+              <w:spacing w:before="0" w:after="0" w:line="269" w:lineRule="auto"/>
+              <w:jc w:val="center"/>
+            </w:pPr>
+            <w:r>
+              <w:rPr>
+                <w:b/>
+                <w:color w:val="A6311B"/>
+              </w:rPr>
+              <w:t>P0</w:t>
+            </w:r>
+          </w:p>
+        </w:tc>
+        <w:tc>
+          <w:tcPr>
+            <w:tcW w:type="dxa" w:w="1800"/>
+            <w:vAlign w:val="center"/>
+            <w:tcMar>
+              <w:top w:w="75" w:type="dxa"/>
+              <w:start w:w="80" w:type="dxa"/>
+              <w:bottom w:w="75" w:type="dxa"/>
+              <w:end w:w="80" w:type="dxa"/>
+            </w:tcMar>
+            <w:shd w:fill="F4F7FC"/>
+          </w:tcPr>
+          <w:p>
+            <w:pPr>
+              <w:spacing w:before="0" w:after="0" w:line="269" w:lineRule="auto"/>
+              <w:jc w:val="left"/>
+            </w:pPr>
+            <w:r>
+              <w:t>企业数据边界</w:t>
+            </w:r>
+          </w:p>
+        </w:tc>
+        <w:tc>
+          <w:tcPr>
+            <w:tcW w:type="dxa" w:w="2664"/>
+            <w:vAlign w:val="center"/>
+            <w:tcMar>
+              <w:top w:w="75" w:type="dxa"/>
+              <w:start w:w="80" w:type="dxa"/>
+              <w:bottom w:w="75" w:type="dxa"/>
+              <w:end w:w="80" w:type="dxa"/>
+            </w:tcMar>
+            <w:shd w:fill="F4F7FC"/>
+          </w:tcPr>
+          <w:p>
+            <w:pPr>
+              <w:spacing w:before="0" w:after="0" w:line="269" w:lineRule="auto"/>
+              <w:jc w:val="left"/>
+            </w:pPr>
+            <w:r>
+              <w:t>DEALER、USER、ADMIN 分别访问经销商工作台并查询业务单据。</w:t>
+            </w:r>
+          </w:p>
+        </w:tc>
+        <w:tc>
+          <w:tcPr>
+            <w:tcW w:type="dxa" w:w="2664"/>
+            <w:vAlign w:val="center"/>
+            <w:tcMar>
+              <w:top w:w="75" w:type="dxa"/>
+              <w:start w:w="80" w:type="dxa"/>
+              <w:bottom w:w="75" w:type="dxa"/>
+              <w:end w:w="80" w:type="dxa"/>
+            </w:tcMar>
+            <w:shd w:fill="F4F7FC"/>
+          </w:tcPr>
+          <w:p>
+            <w:pPr>
+              <w:spacing w:before="0" w:after="0" w:line="269" w:lineRule="auto"/>
+              <w:jc w:val="left"/>
+            </w:pPr>
+            <w:r>
+              <w:t>仅 DEALER 可访问，目录、报价、订单、发票和地址均绑定本企业。</w:t>
+            </w:r>
+          </w:p>
+        </w:tc>
+        <w:tc>
+          <w:tcPr>
+            <w:tcW w:type="dxa" w:w="936"/>
+            <w:vAlign w:val="center"/>
+            <w:tcMar>
+              <w:top w:w="75" w:type="dxa"/>
+              <w:start w:w="80" w:type="dxa"/>
+              <w:bottom w:w="75" w:type="dxa"/>
+              <w:end w:w="80" w:type="dxa"/>
+            </w:tcMar>
+            <w:shd w:fill="F4F7FC"/>
+          </w:tcPr>
+          <w:p>
+            <w:pPr>
+              <w:spacing w:before="0" w:after="0" w:line="269" w:lineRule="auto"/>
+              <w:jc w:val="center"/>
+            </w:pPr>
+            <w:r>
+              <w:t>通过</w:t>
+            </w:r>
+          </w:p>
+        </w:tc>
+      </w:tr>
+      <w:tr>
+        <w:trPr>
+          <w:cantSplit w:val="true"/>
+        </w:trPr>
+        <w:tc>
+          <w:tcPr>
+            <w:tcW w:type="dxa" w:w="1036"/>
+            <w:vAlign w:val="center"/>
+            <w:tcMar>
+              <w:top w:w="75" w:type="dxa"/>
+              <w:start w:w="80" w:type="dxa"/>
+              <w:bottom w:w="75" w:type="dxa"/>
+              <w:end w:w="80" w:type="dxa"/>
+            </w:tcMar>
+            <w:shd w:fill="F4F7FC"/>
+          </w:tcPr>
+          <w:p>
+            <w:pPr>
+              <w:spacing w:before="0" w:after="0" w:line="269" w:lineRule="auto"/>
+              <w:jc w:val="center"/>
+            </w:pPr>
+            <w:r>
+              <w:t>DEA-008</w:t>
+            </w:r>
+          </w:p>
+        </w:tc>
+        <w:tc>
+          <w:tcPr>
+            <w:tcW w:type="dxa" w:w="1368"/>
+            <w:vAlign w:val="center"/>
+            <w:tcMar>
+              <w:top w:w="75" w:type="dxa"/>
+              <w:start w:w="80" w:type="dxa"/>
+              <w:bottom w:w="75" w:type="dxa"/>
+              <w:end w:w="80" w:type="dxa"/>
+            </w:tcMar>
+            <w:shd w:fill="F4F7FC"/>
+          </w:tcPr>
+          <w:p>
+            <w:pPr>
+              <w:spacing w:before="0" w:after="0" w:line="269" w:lineRule="auto"/>
+              <w:jc w:val="center"/>
+            </w:pPr>
+            <w:r>
+              <w:rPr>
+                <w:b/>
+                <w:color w:val="A6311B"/>
+              </w:rPr>
+              <w:t>P0</w:t>
+            </w:r>
+          </w:p>
+        </w:tc>
+        <w:tc>
+          <w:tcPr>
+            <w:tcW w:type="dxa" w:w="1800"/>
+            <w:vAlign w:val="center"/>
+            <w:tcMar>
+              <w:top w:w="75" w:type="dxa"/>
+              <w:start w:w="80" w:type="dxa"/>
+              <w:bottom w:w="75" w:type="dxa"/>
+              <w:end w:w="80" w:type="dxa"/>
+            </w:tcMar>
+            <w:shd w:fill="F4F7FC"/>
+          </w:tcPr>
+          <w:p>
+            <w:pPr>
+              <w:spacing w:before="0" w:after="0" w:line="269" w:lineRule="auto"/>
+              <w:jc w:val="left"/>
+            </w:pPr>
+            <w:r>
+              <w:t>授权目录与快捷下单</w:t>
+            </w:r>
+          </w:p>
+        </w:tc>
+        <w:tc>
+          <w:tcPr>
+            <w:tcW w:type="dxa" w:w="2664"/>
+            <w:vAlign w:val="center"/>
+            <w:tcMar>
+              <w:top w:w="75" w:type="dxa"/>
+              <w:start w:w="80" w:type="dxa"/>
+              <w:bottom w:w="75" w:type="dxa"/>
+              <w:end w:w="80" w:type="dxa"/>
+            </w:tcMar>
+            <w:shd w:fill="F4F7FC"/>
+          </w:tcPr>
+          <w:p>
+            <w:pPr>
+              <w:spacing w:before="0" w:after="0" w:line="269" w:lineRule="auto"/>
+              <w:jc w:val="left"/>
+            </w:pPr>
+            <w:r>
+              <w:t>选择授权商品，分别提交低于和等于 MOQ 的数量。</w:t>
+            </w:r>
+          </w:p>
+        </w:tc>
+        <w:tc>
+          <w:tcPr>
+            <w:tcW w:type="dxa" w:w="2664"/>
+            <w:vAlign w:val="center"/>
+            <w:tcMar>
+              <w:top w:w="75" w:type="dxa"/>
+              <w:start w:w="80" w:type="dxa"/>
+              <w:bottom w:w="75" w:type="dxa"/>
+              <w:end w:w="80" w:type="dxa"/>
+            </w:tcMar>
+            <w:shd w:fill="F4F7FC"/>
+          </w:tcPr>
+          <w:p>
+            <w:pPr>
+              <w:spacing w:before="0" w:after="0" w:line="269" w:lineRule="auto"/>
+              <w:jc w:val="left"/>
+            </w:pPr>
+            <w:r>
+              <w:t>低于 MOQ 被拒绝；合法订单进入待平台确认并保存价格快照。</w:t>
+            </w:r>
+          </w:p>
+        </w:tc>
+        <w:tc>
+          <w:tcPr>
+            <w:tcW w:type="dxa" w:w="936"/>
+            <w:vAlign w:val="center"/>
+            <w:tcMar>
+              <w:top w:w="75" w:type="dxa"/>
+              <w:start w:w="80" w:type="dxa"/>
+              <w:bottom w:w="75" w:type="dxa"/>
+              <w:end w:w="80" w:type="dxa"/>
+            </w:tcMar>
+            <w:shd w:fill="F4F7FC"/>
+          </w:tcPr>
+          <w:p>
+            <w:pPr>
+              <w:spacing w:before="0" w:after="0" w:line="269" w:lineRule="auto"/>
+              <w:jc w:val="center"/>
+            </w:pPr>
+            <w:r>
+              <w:t>通过</w:t>
+            </w:r>
+          </w:p>
+        </w:tc>
+      </w:tr>
+      <w:tr>
+        <w:trPr>
+          <w:cantSplit w:val="true"/>
+        </w:trPr>
+        <w:tc>
+          <w:tcPr>
+            <w:tcW w:type="dxa" w:w="1036"/>
+            <w:vAlign w:val="center"/>
+            <w:tcMar>
+              <w:top w:w="75" w:type="dxa"/>
+              <w:start w:w="80" w:type="dxa"/>
+              <w:bottom w:w="75" w:type="dxa"/>
+              <w:end w:w="80" w:type="dxa"/>
+            </w:tcMar>
+            <w:shd w:fill="F4F7FC"/>
+          </w:tcPr>
+          <w:p>
+            <w:pPr>
+              <w:spacing w:before="0" w:after="0" w:line="269" w:lineRule="auto"/>
+              <w:jc w:val="center"/>
+            </w:pPr>
+            <w:r>
+              <w:t>DEA-009</w:t>
+            </w:r>
+          </w:p>
+        </w:tc>
+        <w:tc>
+          <w:tcPr>
+            <w:tcW w:type="dxa" w:w="1368"/>
+            <w:vAlign w:val="center"/>
+            <w:tcMar>
+              <w:top w:w="75" w:type="dxa"/>
+              <w:start w:w="80" w:type="dxa"/>
+              <w:bottom w:w="75" w:type="dxa"/>
+              <w:end w:w="80" w:type="dxa"/>
+            </w:tcMar>
+            <w:shd w:fill="F4F7FC"/>
+          </w:tcPr>
+          <w:p>
+            <w:pPr>
+              <w:spacing w:before="0" w:after="0" w:line="269" w:lineRule="auto"/>
+              <w:jc w:val="center"/>
+            </w:pPr>
+            <w:r>
+              <w:rPr>
+                <w:b/>
+                <w:color w:val="A6311B"/>
+              </w:rPr>
+              <w:t>P0</w:t>
+            </w:r>
+          </w:p>
+        </w:tc>
+        <w:tc>
+          <w:tcPr>
+            <w:tcW w:type="dxa" w:w="1800"/>
+            <w:vAlign w:val="center"/>
+            <w:tcMar>
+              <w:top w:w="75" w:type="dxa"/>
+              <w:start w:w="80" w:type="dxa"/>
+              <w:bottom w:w="75" w:type="dxa"/>
+              <w:end w:w="80" w:type="dxa"/>
+            </w:tcMar>
+            <w:shd w:fill="F4F7FC"/>
+          </w:tcPr>
+          <w:p>
+            <w:pPr>
+              <w:spacing w:before="0" w:after="0" w:line="269" w:lineRule="auto"/>
+              <w:jc w:val="left"/>
+            </w:pPr>
+            <w:r>
+              <w:t>报价请求</w:t>
+            </w:r>
+          </w:p>
+        </w:tc>
+        <w:tc>
+          <w:tcPr>
+            <w:tcW w:type="dxa" w:w="2664"/>
+            <w:vAlign w:val="center"/>
+            <w:tcMar>
+              <w:top w:w="75" w:type="dxa"/>
+              <w:start w:w="80" w:type="dxa"/>
+              <w:bottom w:w="75" w:type="dxa"/>
+              <w:end w:w="80" w:type="dxa"/>
+            </w:tcMar>
+            <w:shd w:fill="F4F7FC"/>
+          </w:tcPr>
+          <w:p>
+            <w:pPr>
+              <w:spacing w:before="0" w:after="0" w:line="269" w:lineRule="auto"/>
+              <w:jc w:val="left"/>
+            </w:pPr>
+            <w:r>
+              <w:t>选择商品、数量、交期和备注并提交询价。</w:t>
+            </w:r>
+          </w:p>
+        </w:tc>
+        <w:tc>
+          <w:tcPr>
+            <w:tcW w:type="dxa" w:w="2664"/>
+            <w:vAlign w:val="center"/>
+            <w:tcMar>
+              <w:top w:w="75" w:type="dxa"/>
+              <w:start w:w="80" w:type="dxa"/>
+              <w:bottom w:w="75" w:type="dxa"/>
+              <w:end w:w="80" w:type="dxa"/>
+            </w:tcMar>
+            <w:shd w:fill="F4F7FC"/>
+          </w:tcPr>
+          <w:p>
+            <w:pPr>
+              <w:spacing w:before="0" w:after="0" w:line="269" w:lineRule="auto"/>
+              <w:jc w:val="left"/>
+            </w:pPr>
+            <w:r>
+              <w:t>创建已提交报价；商品快照持久化；列表只返回本企业报价。</w:t>
+            </w:r>
+          </w:p>
+        </w:tc>
+        <w:tc>
+          <w:tcPr>
+            <w:tcW w:type="dxa" w:w="936"/>
+            <w:vAlign w:val="center"/>
+            <w:tcMar>
+              <w:top w:w="75" w:type="dxa"/>
+              <w:start w:w="80" w:type="dxa"/>
+              <w:bottom w:w="75" w:type="dxa"/>
+              <w:end w:w="80" w:type="dxa"/>
+            </w:tcMar>
+            <w:shd w:fill="F4F7FC"/>
+          </w:tcPr>
+          <w:p>
+            <w:pPr>
+              <w:spacing w:before="0" w:after="0" w:line="269" w:lineRule="auto"/>
+              <w:jc w:val="center"/>
+            </w:pPr>
+            <w:r>
+              <w:t>通过</w:t>
+            </w:r>
+          </w:p>
+        </w:tc>
+      </w:tr>
+      <w:tr>
+        <w:trPr>
+          <w:cantSplit w:val="true"/>
+        </w:trPr>
+        <w:tc>
+          <w:tcPr>
+            <w:tcW w:type="dxa" w:w="1036"/>
+            <w:vAlign w:val="center"/>
+            <w:tcMar>
+              <w:top w:w="75" w:type="dxa"/>
+              <w:start w:w="80" w:type="dxa"/>
+              <w:bottom w:w="75" w:type="dxa"/>
+              <w:end w:w="80" w:type="dxa"/>
+            </w:tcMar>
+            <w:shd w:fill="F4F7FC"/>
+          </w:tcPr>
+          <w:p>
+            <w:pPr>
+              <w:spacing w:before="0" w:after="0" w:line="269" w:lineRule="auto"/>
+              <w:jc w:val="center"/>
+            </w:pPr>
+            <w:r>
+              <w:t>DEA-010</w:t>
+            </w:r>
+          </w:p>
+        </w:tc>
+        <w:tc>
+          <w:tcPr>
+            <w:tcW w:type="dxa" w:w="1368"/>
+            <w:vAlign w:val="center"/>
+            <w:tcMar>
+              <w:top w:w="75" w:type="dxa"/>
+              <w:start w:w="80" w:type="dxa"/>
+              <w:bottom w:w="75" w:type="dxa"/>
+              <w:end w:w="80" w:type="dxa"/>
+            </w:tcMar>
+            <w:shd w:fill="F4F7FC"/>
+          </w:tcPr>
+          <w:p>
+            <w:pPr>
+              <w:spacing w:before="0" w:after="0" w:line="269" w:lineRule="auto"/>
+              <w:jc w:val="center"/>
+            </w:pPr>
+            <w:r>
+              <w:rPr>
+                <w:b/>
+                <w:color w:val="A6311B"/>
+              </w:rPr>
+              <w:t>P0</w:t>
+            </w:r>
+          </w:p>
+        </w:tc>
+        <w:tc>
+          <w:tcPr>
+            <w:tcW w:type="dxa" w:w="1800"/>
+            <w:vAlign w:val="center"/>
+            <w:tcMar>
+              <w:top w:w="75" w:type="dxa"/>
+              <w:start w:w="80" w:type="dxa"/>
+              <w:bottom w:w="75" w:type="dxa"/>
+              <w:end w:w="80" w:type="dxa"/>
+            </w:tcMar>
+            <w:shd w:fill="F4F7FC"/>
+          </w:tcPr>
+          <w:p>
+            <w:pPr>
+              <w:spacing w:before="0" w:after="0" w:line="269" w:lineRule="auto"/>
+              <w:jc w:val="left"/>
+            </w:pPr>
+            <w:r>
+              <w:t>管理员报价回复</w:t>
+            </w:r>
+          </w:p>
+        </w:tc>
+        <w:tc>
+          <w:tcPr>
+            <w:tcW w:type="dxa" w:w="2664"/>
+            <w:vAlign w:val="center"/>
+            <w:tcMar>
+              <w:top w:w="75" w:type="dxa"/>
+              <w:start w:w="80" w:type="dxa"/>
+              <w:bottom w:w="75" w:type="dxa"/>
+              <w:end w:w="80" w:type="dxa"/>
+            </w:tcMar>
+            <w:shd w:fill="F4F7FC"/>
+          </w:tcPr>
+          <w:p>
+            <w:pPr>
+              <w:spacing w:before="0" w:after="0" w:line="269" w:lineRule="auto"/>
+              <w:jc w:val="left"/>
+            </w:pPr>
+            <w:r>
+              <w:t>管理员填写金额、有效期和说明，再重复处理。</w:t>
+            </w:r>
+          </w:p>
+        </w:tc>
+        <w:tc>
+          <w:tcPr>
+            <w:tcW w:type="dxa" w:w="2664"/>
+            <w:vAlign w:val="center"/>
+            <w:tcMar>
+              <w:top w:w="75" w:type="dxa"/>
+              <w:start w:w="80" w:type="dxa"/>
+              <w:bottom w:w="75" w:type="dxa"/>
+              <w:end w:w="80" w:type="dxa"/>
+            </w:tcMar>
+            <w:shd w:fill="F4F7FC"/>
+          </w:tcPr>
+          <w:p>
+            <w:pPr>
+              <w:spacing w:before="0" w:after="0" w:line="269" w:lineRule="auto"/>
+              <w:jc w:val="left"/>
+            </w:pPr>
+            <w:r>
+              <w:t>缺失必填项返回 400；首次生成报价快照；重复处理返回 409。</w:t>
+            </w:r>
+          </w:p>
+        </w:tc>
+        <w:tc>
+          <w:tcPr>
+            <w:tcW w:type="dxa" w:w="936"/>
+            <w:vAlign w:val="center"/>
+            <w:tcMar>
+              <w:top w:w="75" w:type="dxa"/>
+              <w:start w:w="80" w:type="dxa"/>
+              <w:bottom w:w="75" w:type="dxa"/>
+              <w:end w:w="80" w:type="dxa"/>
+            </w:tcMar>
+            <w:shd w:fill="F4F7FC"/>
+          </w:tcPr>
+          <w:p>
+            <w:pPr>
+              <w:spacing w:before="0" w:after="0" w:line="269" w:lineRule="auto"/>
+              <w:jc w:val="center"/>
+            </w:pPr>
+            <w:r>
+              <w:t>通过</w:t>
+            </w:r>
+          </w:p>
+        </w:tc>
+      </w:tr>
+      <w:tr>
+        <w:trPr>
+          <w:cantSplit w:val="true"/>
+        </w:trPr>
+        <w:tc>
+          <w:tcPr>
+            <w:tcW w:type="dxa" w:w="1036"/>
+            <w:vAlign w:val="center"/>
+            <w:tcMar>
+              <w:top w:w="75" w:type="dxa"/>
+              <w:start w:w="80" w:type="dxa"/>
+              <w:bottom w:w="75" w:type="dxa"/>
+              <w:end w:w="80" w:type="dxa"/>
+            </w:tcMar>
+            <w:shd w:fill="F4F7FC"/>
+          </w:tcPr>
+          <w:p>
+            <w:pPr>
+              <w:spacing w:before="0" w:after="0" w:line="269" w:lineRule="auto"/>
+              <w:jc w:val="center"/>
+            </w:pPr>
+            <w:r>
+              <w:t>DEA-011</w:t>
+            </w:r>
+          </w:p>
+        </w:tc>
+        <w:tc>
+          <w:tcPr>
+            <w:tcW w:type="dxa" w:w="1368"/>
+            <w:vAlign w:val="center"/>
+            <w:tcMar>
+              <w:top w:w="75" w:type="dxa"/>
+              <w:start w:w="80" w:type="dxa"/>
+              <w:bottom w:w="75" w:type="dxa"/>
+              <w:end w:w="80" w:type="dxa"/>
+            </w:tcMar>
+            <w:shd w:fill="F4F7FC"/>
+          </w:tcPr>
+          <w:p>
+            <w:pPr>
+              <w:spacing w:before="0" w:after="0" w:line="269" w:lineRule="auto"/>
+              <w:jc w:val="center"/>
+            </w:pPr>
+            <w:r>
+              <w:rPr>
+                <w:b/>
+                <w:color w:val="A6311B"/>
+              </w:rPr>
+              <w:t>P0</w:t>
+            </w:r>
+          </w:p>
+        </w:tc>
+        <w:tc>
+          <w:tcPr>
+            <w:tcW w:type="dxa" w:w="1800"/>
+            <w:vAlign w:val="center"/>
+            <w:tcMar>
+              <w:top w:w="75" w:type="dxa"/>
+              <w:start w:w="80" w:type="dxa"/>
+              <w:bottom w:w="75" w:type="dxa"/>
+              <w:end w:w="80" w:type="dxa"/>
+            </w:tcMar>
+            <w:shd w:fill="F4F7FC"/>
+          </w:tcPr>
+          <w:p>
+            <w:pPr>
+              <w:spacing w:before="0" w:after="0" w:line="269" w:lineRule="auto"/>
+              <w:jc w:val="left"/>
+            </w:pPr>
+            <w:r>
+              <w:t>订单状态与物流</w:t>
+            </w:r>
+          </w:p>
+        </w:tc>
+        <w:tc>
+          <w:tcPr>
+            <w:tcW w:type="dxa" w:w="2664"/>
+            <w:vAlign w:val="center"/>
+            <w:tcMar>
+              <w:top w:w="75" w:type="dxa"/>
+              <w:start w:w="80" w:type="dxa"/>
+              <w:bottom w:w="75" w:type="dxa"/>
+              <w:end w:w="80" w:type="dxa"/>
+            </w:tcMar>
+            <w:shd w:fill="F4F7FC"/>
+          </w:tcPr>
+          <w:p>
+            <w:pPr>
+              <w:spacing w:before="0" w:after="0" w:line="269" w:lineRule="auto"/>
+              <w:jc w:val="left"/>
+            </w:pPr>
+            <w:r>
+              <w:t>依次确认、登记发货、完成，并尝试跳级或回退。</w:t>
+            </w:r>
+          </w:p>
+        </w:tc>
+        <w:tc>
+          <w:tcPr>
+            <w:tcW w:type="dxa" w:w="2664"/>
+            <w:vAlign w:val="center"/>
+            <w:tcMar>
+              <w:top w:w="75" w:type="dxa"/>
+              <w:start w:w="80" w:type="dxa"/>
+              <w:bottom w:w="75" w:type="dxa"/>
+              <w:end w:w="80" w:type="dxa"/>
+            </w:tcMar>
+            <w:shd w:fill="F4F7FC"/>
+          </w:tcPr>
+          <w:p>
+            <w:pPr>
+              <w:spacing w:before="0" w:after="0" w:line="269" w:lineRule="auto"/>
+              <w:jc w:val="left"/>
+            </w:pPr>
+            <w:r>
+              <w:t>仅合法流转成功；发货必须填写物流单号；非法流转返回 409。</w:t>
+            </w:r>
+          </w:p>
+        </w:tc>
+        <w:tc>
+          <w:tcPr>
+            <w:tcW w:type="dxa" w:w="936"/>
+            <w:vAlign w:val="center"/>
+            <w:tcMar>
+              <w:top w:w="75" w:type="dxa"/>
+              <w:start w:w="80" w:type="dxa"/>
+              <w:bottom w:w="75" w:type="dxa"/>
+              <w:end w:w="80" w:type="dxa"/>
+            </w:tcMar>
+            <w:shd w:fill="F4F7FC"/>
+          </w:tcPr>
+          <w:p>
+            <w:pPr>
+              <w:spacing w:before="0" w:after="0" w:line="269" w:lineRule="auto"/>
+              <w:jc w:val="center"/>
+            </w:pPr>
+            <w:r>
+              <w:t>通过</w:t>
+            </w:r>
+          </w:p>
+        </w:tc>
+      </w:tr>
+      <w:tr>
+        <w:trPr>
+          <w:cantSplit w:val="true"/>
+        </w:trPr>
+        <w:tc>
+          <w:tcPr>
+            <w:tcW w:type="dxa" w:w="1036"/>
+            <w:vAlign w:val="center"/>
+            <w:tcMar>
+              <w:top w:w="75" w:type="dxa"/>
+              <w:start w:w="80" w:type="dxa"/>
+              <w:bottom w:w="75" w:type="dxa"/>
+              <w:end w:w="80" w:type="dxa"/>
+            </w:tcMar>
+            <w:shd w:fill="F4F7FC"/>
+          </w:tcPr>
+          <w:p>
+            <w:pPr>
+              <w:spacing w:before="0" w:after="0" w:line="269" w:lineRule="auto"/>
+              <w:jc w:val="center"/>
+            </w:pPr>
+            <w:r>
+              <w:t>DEA-012</w:t>
+            </w:r>
+          </w:p>
+        </w:tc>
+        <w:tc>
+          <w:tcPr>
+            <w:tcW w:type="dxa" w:w="1368"/>
+            <w:vAlign w:val="center"/>
+            <w:tcMar>
+              <w:top w:w="75" w:type="dxa"/>
+              <w:start w:w="80" w:type="dxa"/>
+              <w:bottom w:w="75" w:type="dxa"/>
+              <w:end w:w="80" w:type="dxa"/>
+            </w:tcMar>
+            <w:shd w:fill="F4F7FC"/>
+          </w:tcPr>
+          <w:p>
+            <w:pPr>
+              <w:spacing w:before="0" w:after="0" w:line="269" w:lineRule="auto"/>
+              <w:jc w:val="center"/>
+            </w:pPr>
+            <w:r>
+              <w:rPr>
+                <w:b/>
+                <w:color w:val="A6311B"/>
+              </w:rPr>
+              <w:t>P0</w:t>
+            </w:r>
+          </w:p>
+        </w:tc>
+        <w:tc>
+          <w:tcPr>
+            <w:tcW w:type="dxa" w:w="1800"/>
+            <w:vAlign w:val="center"/>
+            <w:tcMar>
+              <w:top w:w="75" w:type="dxa"/>
+              <w:start w:w="80" w:type="dxa"/>
+              <w:bottom w:w="75" w:type="dxa"/>
+              <w:end w:w="80" w:type="dxa"/>
+            </w:tcMar>
+            <w:shd w:fill="F4F7FC"/>
+          </w:tcPr>
+          <w:p>
+            <w:pPr>
+              <w:spacing w:before="0" w:after="0" w:line="269" w:lineRule="auto"/>
+              <w:jc w:val="left"/>
+            </w:pPr>
+            <w:r>
+              <w:t>企业停用</w:t>
+            </w:r>
+          </w:p>
+        </w:tc>
+        <w:tc>
+          <w:tcPr>
+            <w:tcW w:type="dxa" w:w="2664"/>
+            <w:vAlign w:val="center"/>
+            <w:tcMar>
+              <w:top w:w="75" w:type="dxa"/>
+              <w:start w:w="80" w:type="dxa"/>
+              <w:bottom w:w="75" w:type="dxa"/>
+              <w:end w:w="80" w:type="dxa"/>
+            </w:tcMar>
+            <w:shd w:fill="F4F7FC"/>
+          </w:tcPr>
+          <w:p>
+            <w:pPr>
+              <w:spacing w:before="0" w:after="0" w:line="269" w:lineRule="auto"/>
+              <w:jc w:val="left"/>
+            </w:pPr>
+            <w:r>
+              <w:t>停用企业后使用成员原会话访问，再重新启用。</w:t>
+            </w:r>
+          </w:p>
+        </w:tc>
+        <w:tc>
+          <w:tcPr>
+            <w:tcW w:type="dxa" w:w="2664"/>
+            <w:vAlign w:val="center"/>
+            <w:tcMar>
+              <w:top w:w="75" w:type="dxa"/>
+              <w:start w:w="80" w:type="dxa"/>
+              <w:bottom w:w="75" w:type="dxa"/>
+              <w:end w:w="80" w:type="dxa"/>
+            </w:tcMar>
+            <w:shd w:fill="F4F7FC"/>
+          </w:tcPr>
+          <w:p>
+            <w:pPr>
+              <w:spacing w:before="0" w:after="0" w:line="269" w:lineRule="auto"/>
+              <w:jc w:val="left"/>
+            </w:pPr>
+            <w:r>
+              <w:t>成员立即失去访问；历史单据保留；重新启用后恢复。</w:t>
+            </w:r>
+          </w:p>
+        </w:tc>
+        <w:tc>
+          <w:tcPr>
+            <w:tcW w:type="dxa" w:w="936"/>
+            <w:vAlign w:val="center"/>
+            <w:tcMar>
+              <w:top w:w="75" w:type="dxa"/>
+              <w:start w:w="80" w:type="dxa"/>
+              <w:bottom w:w="75" w:type="dxa"/>
+              <w:end w:w="80" w:type="dxa"/>
+            </w:tcMar>
+            <w:shd w:fill="F4F7FC"/>
+          </w:tcPr>
+          <w:p>
+            <w:pPr>
+              <w:spacing w:before="0" w:after="0" w:line="269" w:lineRule="auto"/>
+              <w:jc w:val="center"/>
+            </w:pPr>
+            <w:r>
+              <w:t>通过</w:t>
+            </w:r>
+          </w:p>
+        </w:tc>
+      </w:tr>
+      <w:tr>
+        <w:trPr>
+          <w:cantSplit w:val="true"/>
+        </w:trPr>
+        <w:tc>
+          <w:tcPr>
+            <w:tcW w:type="dxa" w:w="1036"/>
+            <w:vAlign w:val="center"/>
+            <w:tcMar>
+              <w:top w:w="75" w:type="dxa"/>
+              <w:start w:w="80" w:type="dxa"/>
+              <w:bottom w:w="75" w:type="dxa"/>
+              <w:end w:w="80" w:type="dxa"/>
+            </w:tcMar>
+            <w:shd w:fill="F4F7FC"/>
+          </w:tcPr>
+          <w:p>
+            <w:pPr>
+              <w:spacing w:before="0" w:after="0" w:line="269" w:lineRule="auto"/>
+              <w:jc w:val="center"/>
+            </w:pPr>
+            <w:r>
+              <w:t>DEA-013</w:t>
+            </w:r>
+          </w:p>
+        </w:tc>
+        <w:tc>
+          <w:tcPr>
+            <w:tcW w:type="dxa" w:w="1368"/>
+            <w:vAlign w:val="center"/>
+            <w:tcMar>
+              <w:top w:w="75" w:type="dxa"/>
+              <w:start w:w="80" w:type="dxa"/>
+              <w:bottom w:w="75" w:type="dxa"/>
+              <w:end w:w="80" w:type="dxa"/>
+            </w:tcMar>
+            <w:shd w:fill="F4F7FC"/>
+          </w:tcPr>
+          <w:p>
+            <w:pPr>
+              <w:spacing w:before="0" w:after="0" w:line="269" w:lineRule="auto"/>
+              <w:jc w:val="center"/>
+            </w:pPr>
+            <w:r>
+              <w:t>P1</w:t>
+            </w:r>
+          </w:p>
+        </w:tc>
+        <w:tc>
+          <w:tcPr>
+            <w:tcW w:type="dxa" w:w="1800"/>
+            <w:vAlign w:val="center"/>
+            <w:tcMar>
+              <w:top w:w="75" w:type="dxa"/>
+              <w:start w:w="80" w:type="dxa"/>
+              <w:bottom w:w="75" w:type="dxa"/>
+              <w:end w:w="80" w:type="dxa"/>
+            </w:tcMar>
+            <w:shd w:fill="F4F7FC"/>
+          </w:tcPr>
+          <w:p>
+            <w:pPr>
+              <w:spacing w:before="0" w:after="0" w:line="269" w:lineRule="auto"/>
+              <w:jc w:val="left"/>
+            </w:pPr>
+            <w:r>
+              <w:t>OWNER 与 MEMBER 权限</w:t>
+            </w:r>
+          </w:p>
+        </w:tc>
+        <w:tc>
+          <w:tcPr>
+            <w:tcW w:type="dxa" w:w="2664"/>
+            <w:vAlign w:val="center"/>
+            <w:tcMar>
+              <w:top w:w="75" w:type="dxa"/>
+              <w:start w:w="80" w:type="dxa"/>
+              <w:bottom w:w="75" w:type="dxa"/>
+              <w:end w:w="80" w:type="dxa"/>
+            </w:tcMar>
+            <w:shd w:fill="F4F7FC"/>
+          </w:tcPr>
+          <w:p>
+            <w:pPr>
+              <w:spacing w:before="0" w:after="0" w:line="269" w:lineRule="auto"/>
+              <w:jc w:val="left"/>
+            </w:pPr>
+            <w:r>
+              <w:t>两种企业内角色分别修改企业资料和新增地址。</w:t>
+            </w:r>
+          </w:p>
+        </w:tc>
+        <w:tc>
+          <w:tcPr>
+            <w:tcW w:type="dxa" w:w="2664"/>
+            <w:vAlign w:val="center"/>
+            <w:tcMar>
+              <w:top w:w="75" w:type="dxa"/>
+              <w:start w:w="80" w:type="dxa"/>
+              <w:bottom w:w="75" w:type="dxa"/>
+              <w:end w:w="80" w:type="dxa"/>
+            </w:tcMar>
+            <w:shd w:fill="F4F7FC"/>
+          </w:tcPr>
+          <w:p>
+            <w:pPr>
+              <w:spacing w:before="0" w:after="0" w:line="269" w:lineRule="auto"/>
+              <w:jc w:val="left"/>
+            </w:pPr>
+            <w:r>
+              <w:t>OWNER 可操作；MEMBER 只读且服务端返回 403。</w:t>
+            </w:r>
+          </w:p>
+        </w:tc>
+        <w:tc>
+          <w:tcPr>
+            <w:tcW w:type="dxa" w:w="936"/>
+            <w:vAlign w:val="center"/>
+            <w:tcMar>
+              <w:top w:w="75" w:type="dxa"/>
+              <w:start w:w="80" w:type="dxa"/>
+              <w:bottom w:w="75" w:type="dxa"/>
+              <w:end w:w="80" w:type="dxa"/>
+            </w:tcMar>
+            <w:shd w:fill="F4F7FC"/>
+          </w:tcPr>
+          <w:p>
+            <w:pPr>
+              <w:spacing w:before="0" w:after="0" w:line="269" w:lineRule="auto"/>
+              <w:jc w:val="center"/>
+            </w:pPr>
+            <w:r>
+              <w:t>通过</w:t>
+            </w:r>
+          </w:p>
+        </w:tc>
+      </w:tr>
+      <w:tr>
+        <w:trPr>
+          <w:cantSplit w:val="true"/>
+        </w:trPr>
+        <w:tc>
+          <w:tcPr>
+            <w:tcW w:type="dxa" w:w="1036"/>
+            <w:vAlign w:val="center"/>
+            <w:tcMar>
+              <w:top w:w="75" w:type="dxa"/>
+              <w:start w:w="80" w:type="dxa"/>
+              <w:bottom w:w="75" w:type="dxa"/>
+              <w:end w:w="80" w:type="dxa"/>
+            </w:tcMar>
+            <w:shd w:fill="F4F7FC"/>
+          </w:tcPr>
+          <w:p>
+            <w:pPr>
+              <w:spacing w:before="0" w:after="0" w:line="269" w:lineRule="auto"/>
+              <w:jc w:val="center"/>
+            </w:pPr>
+            <w:r>
+              <w:t>DEA-014</w:t>
+            </w:r>
+          </w:p>
+        </w:tc>
+        <w:tc>
+          <w:tcPr>
+            <w:tcW w:type="dxa" w:w="1368"/>
+            <w:vAlign w:val="center"/>
+            <w:tcMar>
+              <w:top w:w="75" w:type="dxa"/>
+              <w:start w:w="80" w:type="dxa"/>
+              <w:bottom w:w="75" w:type="dxa"/>
+              <w:end w:w="80" w:type="dxa"/>
+            </w:tcMar>
+            <w:shd w:fill="F4F7FC"/>
+          </w:tcPr>
+          <w:p>
+            <w:pPr>
+              <w:spacing w:before="0" w:after="0" w:line="269" w:lineRule="auto"/>
+              <w:jc w:val="center"/>
+            </w:pPr>
+            <w:r>
+              <w:t>P1</w:t>
+            </w:r>
+          </w:p>
+        </w:tc>
+        <w:tc>
+          <w:tcPr>
+            <w:tcW w:type="dxa" w:w="1800"/>
+            <w:vAlign w:val="center"/>
+            <w:tcMar>
+              <w:top w:w="75" w:type="dxa"/>
+              <w:start w:w="80" w:type="dxa"/>
+              <w:bottom w:w="75" w:type="dxa"/>
+              <w:end w:w="80" w:type="dxa"/>
+            </w:tcMar>
+            <w:shd w:fill="F4F7FC"/>
+          </w:tcPr>
+          <w:p>
+            <w:pPr>
+              <w:spacing w:before="0" w:after="0" w:line="269" w:lineRule="auto"/>
+              <w:jc w:val="left"/>
+            </w:pPr>
+            <w:r>
+              <w:t>客户支持与安全</w:t>
+            </w:r>
+          </w:p>
+        </w:tc>
+        <w:tc>
+          <w:tcPr>
+            <w:tcW w:type="dxa" w:w="2664"/>
+            <w:vAlign w:val="center"/>
+            <w:tcMar>
+              <w:top w:w="75" w:type="dxa"/>
+              <w:start w:w="80" w:type="dxa"/>
+              <w:bottom w:w="75" w:type="dxa"/>
+              <w:end w:w="80" w:type="dxa"/>
+            </w:tcMar>
+            <w:shd w:fill="F4F7FC"/>
+          </w:tcPr>
+          <w:p>
+            <w:pPr>
+              <w:spacing w:before="0" w:after="0" w:line="269" w:lineRule="auto"/>
+              <w:jc w:val="left"/>
+            </w:pPr>
+            <w:r>
+              <w:t>提交支持请求，检查个人资料和密码表单。</w:t>
+            </w:r>
+          </w:p>
+        </w:tc>
+        <w:tc>
+          <w:tcPr>
+            <w:tcW w:type="dxa" w:w="2664"/>
+            <w:vAlign w:val="center"/>
+            <w:tcMar>
+              <w:top w:w="75" w:type="dxa"/>
+              <w:start w:w="80" w:type="dxa"/>
+              <w:bottom w:w="75" w:type="dxa"/>
+              <w:end w:w="80" w:type="dxa"/>
+            </w:tcMar>
+            <w:shd w:fill="F4F7FC"/>
+          </w:tcPr>
+          <w:p>
+            <w:pPr>
+              <w:spacing w:before="0" w:after="0" w:line="269" w:lineRule="auto"/>
+              <w:jc w:val="left"/>
+            </w:pPr>
+            <w:r>
+              <w:t>请求进入统一留言队列；密码满足长度与复杂度要求。</w:t>
+            </w:r>
+          </w:p>
+        </w:tc>
+        <w:tc>
+          <w:tcPr>
+            <w:tcW w:type="dxa" w:w="936"/>
+            <w:vAlign w:val="center"/>
+            <w:tcMar>
+              <w:top w:w="75" w:type="dxa"/>
+              <w:start w:w="80" w:type="dxa"/>
+              <w:bottom w:w="75" w:type="dxa"/>
+              <w:end w:w="80" w:type="dxa"/>
+            </w:tcMar>
+            <w:shd w:fill="F4F7FC"/>
+          </w:tcPr>
+          <w:p>
+            <w:pPr>
+              <w:spacing w:before="0" w:after="0" w:line="269" w:lineRule="auto"/>
+              <w:jc w:val="center"/>
+            </w:pPr>
+            <w:r>
+              <w:t>通过</w:t>
+            </w:r>
+          </w:p>
+        </w:tc>
+      </w:tr>
     </w:tbl>
     <w:p>
       <w:pPr>
@@ -9067,6 +10355,7 @@
       </w:pPr>
       <w:r>
         <w:rPr>
+          <w:rFonts w:eastAsia="Microsoft YaHei"/>
           <w:color w:val="776D61"/>
           <w:sz w:val="17"/>
         </w:rPr>
@@ -9078,6 +10367,9 @@
         <w:pStyle w:val="Heading2"/>
       </w:pPr>
       <w:r>
+        <w:rPr>
+          <w:rFonts w:eastAsia="Microsoft YaHei"/>
+        </w:rPr>
         <w:t>站点运营</w:t>
       </w:r>
     </w:p>
@@ -10440,18 +11732,14 @@
           </w:tcPr>
           <w:p>
             <w:pPr>
-              <w:spacing w:after="0" w:line="259" w:lineRule="auto"/>
-              <w:jc w:val="left"/>
-            </w:pPr>
-            <w:r/>
-            <w:r>
-              <w:rPr>
-                <w:rFonts w:ascii="Microsoft YaHei" w:hAnsi="Microsoft YaHei" w:eastAsia="微软雅黑"/>
-                <w:b w:val="0"/>
-                <w:color w:val="000000"/>
+              <w:spacing w:before="0" w:after="0" w:line="269" w:lineRule="auto"/>
+            </w:pPr>
+            <w:r>
+              <w:rPr>
+                <w:rFonts w:ascii="Aptos" w:hAnsi="Aptos" w:eastAsia="Microsoft YaHei"/>
                 <w:sz w:val="17"/>
               </w:rPr>
-              <w:t>读取后台概览并与五张业务表 COUNT 对账。</w:t>
+              <w:t>读取后台概览并与七类业务统计 COUNT 对账。</w:t>
             </w:r>
           </w:p>
         </w:tc>
@@ -10468,18 +11756,14 @@
           </w:tcPr>
           <w:p>
             <w:pPr>
-              <w:spacing w:after="0" w:line="259" w:lineRule="auto"/>
-              <w:jc w:val="left"/>
-            </w:pPr>
-            <w:r/>
-            <w:r>
-              <w:rPr>
-                <w:rFonts w:ascii="Microsoft YaHei" w:hAnsi="Microsoft YaHei" w:eastAsia="微软雅黑"/>
-                <w:b w:val="0"/>
-                <w:color w:val="000000"/>
+              <w:spacing w:before="0" w:after="0" w:line="269" w:lineRule="auto"/>
+            </w:pPr>
+            <w:r>
+              <w:rPr>
+                <w:rFonts w:ascii="Aptos" w:hAnsi="Aptos" w:eastAsia="Microsoft YaHei"/>
                 <w:sz w:val="17"/>
               </w:rPr>
-              <w:t>产品、文章、用户、待审申请、待处理留言完全一致。</w:t>
+              <w:t>产品、文章、用户、待审申请、待处理留言、待回复报价和待确认订单完全一致。</w:t>
             </w:r>
           </w:p>
         </w:tc>
@@ -10698,6 +11982,7 @@
       </w:pPr>
       <w:r>
         <w:rPr>
+          <w:rFonts w:eastAsia="Microsoft YaHei"/>
           <w:color w:val="776D61"/>
           <w:sz w:val="17"/>
         </w:rPr>
@@ -10709,6 +11994,9 @@
         <w:pStyle w:val="Heading2"/>
       </w:pPr>
       <w:r>
+        <w:rPr>
+          <w:rFonts w:eastAsia="Microsoft YaHei"/>
+        </w:rPr>
         <w:t>界面兼容</w:t>
       </w:r>
     </w:p>
@@ -11791,6 +13079,411 @@
           </w:p>
         </w:tc>
       </w:tr>
+      <w:tr>
+        <w:trPr>
+          <w:cantSplit w:val="true"/>
+        </w:trPr>
+        <w:tc>
+          <w:tcPr>
+            <w:tcW w:type="dxa" w:w="1036"/>
+            <w:vAlign w:val="center"/>
+            <w:tcMar>
+              <w:top w:w="75" w:type="dxa"/>
+              <w:start w:w="80" w:type="dxa"/>
+              <w:bottom w:w="75" w:type="dxa"/>
+              <w:end w:w="80" w:type="dxa"/>
+            </w:tcMar>
+          </w:tcPr>
+          <w:p>
+            <w:pPr>
+              <w:spacing w:before="0" w:after="0" w:line="269" w:lineRule="auto"/>
+              <w:jc w:val="center"/>
+            </w:pPr>
+            <w:r>
+              <w:t>UI-006</w:t>
+            </w:r>
+          </w:p>
+        </w:tc>
+        <w:tc>
+          <w:tcPr>
+            <w:tcW w:type="dxa" w:w="1368"/>
+            <w:vAlign w:val="center"/>
+            <w:tcMar>
+              <w:top w:w="75" w:type="dxa"/>
+              <w:start w:w="80" w:type="dxa"/>
+              <w:bottom w:w="75" w:type="dxa"/>
+              <w:end w:w="80" w:type="dxa"/>
+            </w:tcMar>
+          </w:tcPr>
+          <w:p>
+            <w:pPr>
+              <w:spacing w:before="0" w:after="0" w:line="269" w:lineRule="auto"/>
+              <w:jc w:val="center"/>
+            </w:pPr>
+            <w:r>
+              <w:rPr>
+                <w:b/>
+                <w:color w:val="A6311B"/>
+              </w:rPr>
+              <w:t>P0</w:t>
+            </w:r>
+          </w:p>
+        </w:tc>
+        <w:tc>
+          <w:tcPr>
+            <w:tcW w:type="dxa" w:w="1800"/>
+            <w:vAlign w:val="center"/>
+            <w:tcMar>
+              <w:top w:w="75" w:type="dxa"/>
+              <w:start w:w="80" w:type="dxa"/>
+              <w:bottom w:w="75" w:type="dxa"/>
+              <w:end w:w="80" w:type="dxa"/>
+            </w:tcMar>
+          </w:tcPr>
+          <w:p>
+            <w:pPr>
+              <w:spacing w:before="0" w:after="0" w:line="269" w:lineRule="auto"/>
+              <w:jc w:val="left"/>
+            </w:pPr>
+            <w:r>
+              <w:t>经销商独立工作台</w:t>
+            </w:r>
+          </w:p>
+        </w:tc>
+        <w:tc>
+          <w:tcPr>
+            <w:tcW w:type="dxa" w:w="2664"/>
+            <w:vAlign w:val="center"/>
+            <w:tcMar>
+              <w:top w:w="75" w:type="dxa"/>
+              <w:start w:w="80" w:type="dxa"/>
+              <w:bottom w:w="75" w:type="dxa"/>
+              <w:end w:w="80" w:type="dxa"/>
+            </w:tcMar>
+          </w:tcPr>
+          <w:p>
+            <w:pPr>
+              <w:spacing w:before="0" w:after="0" w:line="269" w:lineRule="auto"/>
+              <w:jc w:val="left"/>
+            </w:pPr>
+            <w:r>
+              <w:t>登录 dealer_demo，依次进入全部经销商业务入口。</w:t>
+            </w:r>
+          </w:p>
+        </w:tc>
+        <w:tc>
+          <w:tcPr>
+            <w:tcW w:type="dxa" w:w="2664"/>
+            <w:vAlign w:val="center"/>
+            <w:tcMar>
+              <w:top w:w="75" w:type="dxa"/>
+              <w:start w:w="80" w:type="dxa"/>
+              <w:bottom w:w="75" w:type="dxa"/>
+              <w:end w:w="80" w:type="dxa"/>
+            </w:tcMar>
+          </w:tcPr>
+          <w:p>
+            <w:pPr>
+              <w:spacing w:before="0" w:after="0" w:line="269" w:lineRule="auto"/>
+              <w:jc w:val="left"/>
+            </w:pPr>
+            <w:r>
+              <w:t>不混用官网导航；所有入口有真实页面和状态反馈；中文无乱码。</w:t>
+            </w:r>
+          </w:p>
+        </w:tc>
+        <w:tc>
+          <w:tcPr>
+            <w:tcW w:type="dxa" w:w="936"/>
+            <w:vAlign w:val="center"/>
+            <w:tcMar>
+              <w:top w:w="75" w:type="dxa"/>
+              <w:start w:w="80" w:type="dxa"/>
+              <w:bottom w:w="75" w:type="dxa"/>
+              <w:end w:w="80" w:type="dxa"/>
+            </w:tcMar>
+          </w:tcPr>
+          <w:p>
+            <w:pPr>
+              <w:spacing w:before="0" w:after="0" w:line="269" w:lineRule="auto"/>
+              <w:jc w:val="center"/>
+            </w:pPr>
+            <w:r>
+              <w:t>通过</w:t>
+            </w:r>
+          </w:p>
+        </w:tc>
+      </w:tr>
+      <w:tr>
+        <w:trPr>
+          <w:cantSplit w:val="true"/>
+        </w:trPr>
+        <w:tc>
+          <w:tcPr>
+            <w:tcW w:type="dxa" w:w="1036"/>
+            <w:vAlign w:val="center"/>
+            <w:tcMar>
+              <w:top w:w="75" w:type="dxa"/>
+              <w:start w:w="80" w:type="dxa"/>
+              <w:bottom w:w="75" w:type="dxa"/>
+              <w:end w:w="80" w:type="dxa"/>
+            </w:tcMar>
+          </w:tcPr>
+          <w:p>
+            <w:pPr>
+              <w:spacing w:before="0" w:after="0" w:line="269" w:lineRule="auto"/>
+              <w:jc w:val="center"/>
+            </w:pPr>
+            <w:r>
+              <w:t>UI-007</w:t>
+            </w:r>
+          </w:p>
+        </w:tc>
+        <w:tc>
+          <w:tcPr>
+            <w:tcW w:type="dxa" w:w="1368"/>
+            <w:vAlign w:val="center"/>
+            <w:tcMar>
+              <w:top w:w="75" w:type="dxa"/>
+              <w:start w:w="80" w:type="dxa"/>
+              <w:bottom w:w="75" w:type="dxa"/>
+              <w:end w:w="80" w:type="dxa"/>
+            </w:tcMar>
+          </w:tcPr>
+          <w:p>
+            <w:pPr>
+              <w:spacing w:before="0" w:after="0" w:line="269" w:lineRule="auto"/>
+              <w:jc w:val="center"/>
+            </w:pPr>
+            <w:r>
+              <w:rPr>
+                <w:b/>
+                <w:color w:val="A6311B"/>
+              </w:rPr>
+              <w:t>P0</w:t>
+            </w:r>
+          </w:p>
+        </w:tc>
+        <w:tc>
+          <w:tcPr>
+            <w:tcW w:type="dxa" w:w="1800"/>
+            <w:vAlign w:val="center"/>
+            <w:tcMar>
+              <w:top w:w="75" w:type="dxa"/>
+              <w:start w:w="80" w:type="dxa"/>
+              <w:bottom w:w="75" w:type="dxa"/>
+              <w:end w:w="80" w:type="dxa"/>
+            </w:tcMar>
+          </w:tcPr>
+          <w:p>
+            <w:pPr>
+              <w:spacing w:before="0" w:after="0" w:line="269" w:lineRule="auto"/>
+              <w:jc w:val="left"/>
+            </w:pPr>
+            <w:r>
+              <w:t>管理端危险操作约束</w:t>
+            </w:r>
+          </w:p>
+        </w:tc>
+        <w:tc>
+          <w:tcPr>
+            <w:tcW w:type="dxa" w:w="2664"/>
+            <w:vAlign w:val="center"/>
+            <w:tcMar>
+              <w:top w:w="75" w:type="dxa"/>
+              <w:start w:w="80" w:type="dxa"/>
+              <w:bottom w:w="75" w:type="dxa"/>
+              <w:end w:w="80" w:type="dxa"/>
+            </w:tcMar>
+          </w:tcPr>
+          <w:p>
+            <w:pPr>
+              <w:spacing w:before="0" w:after="0" w:line="269" w:lineRule="auto"/>
+              <w:jc w:val="left"/>
+            </w:pPr>
+            <w:r>
+              <w:t>检查停用、审核、报价回复、订单流转、删除和发布。</w:t>
+            </w:r>
+          </w:p>
+        </w:tc>
+        <w:tc>
+          <w:tcPr>
+            <w:tcW w:type="dxa" w:w="2664"/>
+            <w:vAlign w:val="center"/>
+            <w:tcMar>
+              <w:top w:w="75" w:type="dxa"/>
+              <w:start w:w="80" w:type="dxa"/>
+              <w:bottom w:w="75" w:type="dxa"/>
+              <w:end w:w="80" w:type="dxa"/>
+            </w:tcMar>
+          </w:tcPr>
+          <w:p>
+            <w:pPr>
+              <w:spacing w:before="0" w:after="0" w:line="269" w:lineRule="auto"/>
+              <w:jc w:val="left"/>
+            </w:pPr>
+            <w:r>
+              <w:t>显示影响范围并二次确认；非法状态动作不展示且后端拒绝。</w:t>
+            </w:r>
+          </w:p>
+        </w:tc>
+        <w:tc>
+          <w:tcPr>
+            <w:tcW w:type="dxa" w:w="936"/>
+            <w:vAlign w:val="center"/>
+            <w:tcMar>
+              <w:top w:w="75" w:type="dxa"/>
+              <w:start w:w="80" w:type="dxa"/>
+              <w:bottom w:w="75" w:type="dxa"/>
+              <w:end w:w="80" w:type="dxa"/>
+            </w:tcMar>
+          </w:tcPr>
+          <w:p>
+            <w:pPr>
+              <w:spacing w:before="0" w:after="0" w:line="269" w:lineRule="auto"/>
+              <w:jc w:val="center"/>
+            </w:pPr>
+            <w:r>
+              <w:t>通过</w:t>
+            </w:r>
+          </w:p>
+        </w:tc>
+      </w:tr>
+      <w:tr>
+        <w:trPr>
+          <w:cantSplit w:val="true"/>
+        </w:trPr>
+        <w:tc>
+          <w:tcPr>
+            <w:tcW w:type="dxa" w:w="1036"/>
+            <w:vAlign w:val="center"/>
+            <w:tcMar>
+              <w:top w:w="75" w:type="dxa"/>
+              <w:start w:w="80" w:type="dxa"/>
+              <w:bottom w:w="75" w:type="dxa"/>
+              <w:end w:w="80" w:type="dxa"/>
+            </w:tcMar>
+          </w:tcPr>
+          <w:p>
+            <w:pPr>
+              <w:spacing w:before="0" w:after="0" w:line="269" w:lineRule="auto"/>
+              <w:jc w:val="center"/>
+            </w:pPr>
+            <w:r>
+              <w:t>UI-008</w:t>
+            </w:r>
+          </w:p>
+        </w:tc>
+        <w:tc>
+          <w:tcPr>
+            <w:tcW w:type="dxa" w:w="1368"/>
+            <w:vAlign w:val="center"/>
+            <w:tcMar>
+              <w:top w:w="75" w:type="dxa"/>
+              <w:start w:w="80" w:type="dxa"/>
+              <w:bottom w:w="75" w:type="dxa"/>
+              <w:end w:w="80" w:type="dxa"/>
+            </w:tcMar>
+          </w:tcPr>
+          <w:p>
+            <w:pPr>
+              <w:spacing w:before="0" w:after="0" w:line="269" w:lineRule="auto"/>
+              <w:jc w:val="center"/>
+            </w:pPr>
+            <w:r>
+              <w:rPr>
+                <w:b/>
+                <w:color w:val="A6311B"/>
+              </w:rPr>
+              <w:t>P0</w:t>
+            </w:r>
+          </w:p>
+        </w:tc>
+        <w:tc>
+          <w:tcPr>
+            <w:tcW w:type="dxa" w:w="1800"/>
+            <w:vAlign w:val="center"/>
+            <w:tcMar>
+              <w:top w:w="75" w:type="dxa"/>
+              <w:start w:w="80" w:type="dxa"/>
+              <w:bottom w:w="75" w:type="dxa"/>
+              <w:end w:w="80" w:type="dxa"/>
+            </w:tcMar>
+          </w:tcPr>
+          <w:p>
+            <w:pPr>
+              <w:spacing w:before="0" w:after="0" w:line="269" w:lineRule="auto"/>
+              <w:jc w:val="left"/>
+            </w:pPr>
+            <w:r>
+              <w:t>历史业务文本修复</w:t>
+            </w:r>
+          </w:p>
+        </w:tc>
+        <w:tc>
+          <w:tcPr>
+            <w:tcW w:type="dxa" w:w="2664"/>
+            <w:vAlign w:val="center"/>
+            <w:tcMar>
+              <w:top w:w="75" w:type="dxa"/>
+              <w:start w:w="80" w:type="dxa"/>
+              <w:bottom w:w="75" w:type="dxa"/>
+              <w:end w:w="80" w:type="dxa"/>
+            </w:tcMar>
+          </w:tcPr>
+          <w:p>
+            <w:pPr>
+              <w:spacing w:before="0" w:after="0" w:line="269" w:lineRule="auto"/>
+              <w:jc w:val="left"/>
+            </w:pPr>
+            <w:r>
+              <w:t>扫描申请、企业、产品、内容、支持、订单、报价和地址文本列。</w:t>
+            </w:r>
+          </w:p>
+        </w:tc>
+        <w:tc>
+          <w:tcPr>
+            <w:tcW w:type="dxa" w:w="2664"/>
+            <w:vAlign w:val="center"/>
+            <w:tcMar>
+              <w:top w:w="75" w:type="dxa"/>
+              <w:start w:w="80" w:type="dxa"/>
+              <w:bottom w:w="75" w:type="dxa"/>
+              <w:end w:w="80" w:type="dxa"/>
+            </w:tcMar>
+          </w:tcPr>
+          <w:p>
+            <w:pPr>
+              <w:spacing w:before="0" w:after="0" w:line="269" w:lineRule="auto"/>
+              <w:jc w:val="left"/>
+            </w:pPr>
+            <w:r>
+              <w:t>修复典型双重编码记录；全库无 mojibake 特征。</w:t>
+            </w:r>
+          </w:p>
+        </w:tc>
+        <w:tc>
+          <w:tcPr>
+            <w:tcW w:type="dxa" w:w="936"/>
+            <w:vAlign w:val="center"/>
+            <w:tcMar>
+              <w:top w:w="75" w:type="dxa"/>
+              <w:start w:w="80" w:type="dxa"/>
+              <w:bottom w:w="75" w:type="dxa"/>
+              <w:end w:w="80" w:type="dxa"/>
+            </w:tcMar>
+          </w:tcPr>
+          <w:p>
+            <w:pPr>
+              <w:spacing w:before="0" w:after="0" w:line="269" w:lineRule="auto"/>
+              <w:jc w:val="center"/>
+            </w:pPr>
+            <w:r>
+              <w:t>通过</w:t>
+            </w:r>
+          </w:p>
+        </w:tc>
+      </w:tr>
     </w:tbl>
     <w:p>
       <w:pPr>
@@ -11798,6 +13491,7 @@
       </w:pPr>
       <w:r>
         <w:rPr>
+          <w:rFonts w:eastAsia="Microsoft YaHei"/>
           <w:color w:val="776D61"/>
           <w:sz w:val="17"/>
         </w:rPr>
@@ -11809,6 +13503,9 @@
         <w:pStyle w:val="Heading1"/>
       </w:pPr>
       <w:r>
+        <w:rPr>
+          <w:rFonts w:eastAsia="Microsoft YaHei"/>
+        </w:rPr>
         <w:t>4 缺陷修复与回归重点</w:t>
       </w:r>
     </w:p>
@@ -12366,12 +14063,191 @@
           </w:p>
         </w:tc>
       </w:tr>
+      <w:tr>
+        <w:tc>
+          <w:tcPr>
+            <w:tcW w:type="dxa" w:w="2951"/>
+            <w:vAlign w:val="center"/>
+            <w:tcMar>
+              <w:top w:w="90" w:type="dxa"/>
+              <w:start w:w="100" w:type="dxa"/>
+              <w:bottom w:w="90" w:type="dxa"/>
+              <w:end w:w="100" w:type="dxa"/>
+            </w:tcMar>
+            <w:shd w:fill="F3F3F3"/>
+          </w:tcPr>
+          <w:p>
+            <w:pPr>
+              <w:spacing w:before="0" w:after="0" w:line="269" w:lineRule="auto"/>
+            </w:pPr>
+            <w:r>
+              <w:t>经销商门户只有申请记录</w:t>
+            </w:r>
+          </w:p>
+        </w:tc>
+        <w:tc>
+          <w:tcPr>
+            <w:tcW w:type="dxa" w:w="7488"/>
+            <w:vAlign w:val="center"/>
+            <w:tcMar>
+              <w:top w:w="90" w:type="dxa"/>
+              <w:start w:w="100" w:type="dxa"/>
+              <w:bottom w:w="90" w:type="dxa"/>
+              <w:end w:w="100" w:type="dxa"/>
+            </w:tcMar>
+            <w:shd w:fill="F3F3F3"/>
+          </w:tcPr>
+          <w:p>
+            <w:pPr>
+              <w:spacing w:before="0" w:after="0" w:line="269" w:lineRule="auto"/>
+            </w:pPr>
+            <w:r>
+              <w:t>改为独立业务工作台，接入授权目录、报价、快捷下单、订单、发票、企业和支持。</w:t>
+            </w:r>
+          </w:p>
+        </w:tc>
+      </w:tr>
+      <w:tr>
+        <w:tc>
+          <w:tcPr>
+            <w:tcW w:type="dxa" w:w="2951"/>
+            <w:vAlign w:val="center"/>
+            <w:tcMar>
+              <w:top w:w="90" w:type="dxa"/>
+              <w:start w:w="100" w:type="dxa"/>
+              <w:bottom w:w="90" w:type="dxa"/>
+              <w:end w:w="100" w:type="dxa"/>
+            </w:tcMar>
+            <w:shd w:fill="F3F3F3"/>
+          </w:tcPr>
+          <w:p>
+            <w:pPr>
+              <w:spacing w:before="0" w:after="0" w:line="269" w:lineRule="auto"/>
+            </w:pPr>
+            <w:r>
+              <w:t>管理员缺少业务约束</w:t>
+            </w:r>
+          </w:p>
+        </w:tc>
+        <w:tc>
+          <w:tcPr>
+            <w:tcW w:type="dxa" w:w="7488"/>
+            <w:vAlign w:val="center"/>
+            <w:tcMar>
+              <w:top w:w="90" w:type="dxa"/>
+              <w:start w:w="100" w:type="dxa"/>
+              <w:bottom w:w="90" w:type="dxa"/>
+              <w:end w:w="100" w:type="dxa"/>
+            </w:tcMar>
+            <w:shd w:fill="F3F3F3"/>
+          </w:tcPr>
+          <w:p>
+            <w:pPr>
+              <w:spacing w:before="0" w:after="0" w:line="269" w:lineRule="auto"/>
+            </w:pPr>
+            <w:r>
+              <w:t>补充价格关系、折扣范围、状态机、当前账号保护、危险操作确认和 OWNER 企业权限。</w:t>
+            </w:r>
+          </w:p>
+        </w:tc>
+      </w:tr>
+      <w:tr>
+        <w:tc>
+          <w:tcPr>
+            <w:tcW w:type="dxa" w:w="2951"/>
+            <w:vAlign w:val="center"/>
+            <w:tcMar>
+              <w:top w:w="90" w:type="dxa"/>
+              <w:start w:w="100" w:type="dxa"/>
+              <w:bottom w:w="90" w:type="dxa"/>
+              <w:end w:w="100" w:type="dxa"/>
+            </w:tcMar>
+            <w:shd w:fill="F3F3F3"/>
+          </w:tcPr>
+          <w:p>
+            <w:pPr>
+              <w:spacing w:before="0" w:after="0" w:line="269" w:lineRule="auto"/>
+            </w:pPr>
+            <w:r>
+              <w:t>申请记录仍有乱码</w:t>
+            </w:r>
+          </w:p>
+        </w:tc>
+        <w:tc>
+          <w:tcPr>
+            <w:tcW w:type="dxa" w:w="7488"/>
+            <w:vAlign w:val="center"/>
+            <w:tcMar>
+              <w:top w:w="90" w:type="dxa"/>
+              <w:start w:w="100" w:type="dxa"/>
+              <w:bottom w:w="90" w:type="dxa"/>
+              <w:end w:w="100" w:type="dxa"/>
+            </w:tcMar>
+            <w:shd w:fill="F3F3F3"/>
+          </w:tcPr>
+          <w:p>
+            <w:pPr>
+              <w:spacing w:before="0" w:after="0" w:line="269" w:lineRule="auto"/>
+            </w:pPr>
+            <w:r>
+              <w:t>UTF-8 修复扩展到经销商申请及所有新增业务文本列，并加入 CI 中文断言。</w:t>
+            </w:r>
+          </w:p>
+        </w:tc>
+      </w:tr>
+      <w:tr>
+        <w:tc>
+          <w:tcPr>
+            <w:tcW w:type="dxa" w:w="2951"/>
+            <w:vAlign w:val="center"/>
+            <w:tcMar>
+              <w:top w:w="90" w:type="dxa"/>
+              <w:start w:w="100" w:type="dxa"/>
+              <w:bottom w:w="90" w:type="dxa"/>
+              <w:end w:w="100" w:type="dxa"/>
+            </w:tcMar>
+            <w:shd w:fill="F3F3F3"/>
+          </w:tcPr>
+          <w:p>
+            <w:pPr>
+              <w:spacing w:before="0" w:after="0" w:line="269" w:lineRule="auto"/>
+            </w:pPr>
+            <w:r>
+              <w:t>B2B 单据无人处理</w:t>
+            </w:r>
+          </w:p>
+        </w:tc>
+        <w:tc>
+          <w:tcPr>
+            <w:tcW w:type="dxa" w:w="7488"/>
+            <w:vAlign w:val="center"/>
+            <w:tcMar>
+              <w:top w:w="90" w:type="dxa"/>
+              <w:start w:w="100" w:type="dxa"/>
+              <w:bottom w:w="90" w:type="dxa"/>
+              <w:end w:w="100" w:type="dxa"/>
+            </w:tcMar>
+            <w:shd w:fill="F3F3F3"/>
+          </w:tcPr>
+          <w:p>
+            <w:pPr>
+              <w:spacing w:before="0" w:after="0" w:line="269" w:lineRule="auto"/>
+            </w:pPr>
+            <w:r>
+              <w:t>新增管理端报价回复、订单确认、物流登记、完成和发票归档入口。</w:t>
+            </w:r>
+          </w:p>
+        </w:tc>
+      </w:tr>
     </w:tbl>
     <w:p>
       <w:pPr>
         <w:pStyle w:val="Heading1"/>
       </w:pPr>
       <w:r>
+        <w:rPr>
+          <w:rFonts w:eastAsia="Microsoft YaHei"/>
+        </w:rPr>
         <w:t>5 课程演示执行清单</w:t>
       </w:r>
     </w:p>
@@ -12380,7 +14256,10 @@
         <w:pStyle w:val="ListNumber"/>
       </w:pPr>
       <w:r>
-        <w:t>使用新数据卷启动 Compose，保存容器 healthy 和首页截图。</w:t>
+        <w:rPr>
+          <w:rFonts w:eastAsia="Microsoft YaHei"/>
+        </w:rPr>
+        <w:t>使用新数据卷启动 Compose，确认三个容器 healthy，并检查 UTF-8 中文断言。</w:t>
       </w:r>
     </w:p>
     <w:p>
@@ -12388,7 +14267,10 @@
         <w:pStyle w:val="ListNumber"/>
       </w:pPr>
       <w:r>
-        <w:t>使用游客、普通用户、经销商和管理员四种身份验证 401 与 403 边界。</w:t>
+        <w:rPr>
+          <w:rFonts w:eastAsia="Microsoft YaHei"/>
+        </w:rPr>
+        <w:t>使用游客、普通用户、经销商和管理员四种身份验证 401、403 与企业数据边界。</w:t>
       </w:r>
     </w:p>
     <w:p>
@@ -12396,7 +14278,10 @@
         <w:pStyle w:val="ListNumber"/>
       </w:pPr>
       <w:r>
-        <w:t>管理员新增并发布产品和文章，刷新前台列表与详情确认立即出现。</w:t>
+        <w:rPr>
+          <w:rFonts w:eastAsia="Microsoft YaHei"/>
+        </w:rPr>
+        <w:t>使用 dealer_demo 演示授权目录、MOQ、询价、快捷下单、订单、发票、企业地址和支持。</w:t>
       </w:r>
     </w:p>
     <w:p>
@@ -12404,7 +14289,10 @@
         <w:pStyle w:val="ListNumber"/>
       </w:pPr>
       <w:r>
-        <w:t>游客提交留言，管理员严格按处理中、已完成处理；观察概览待处理数变化。</w:t>
+        <w:rPr>
+          <w:rFonts w:eastAsia="Microsoft YaHei"/>
+        </w:rPr>
+        <w:t>使用 admin 演示申请审核、企业停用、报价回复、订单状态与物流、产品和内容管理。</w:t>
       </w:r>
     </w:p>
     <w:p>
@@ -12412,6 +14300,9 @@
         <w:pStyle w:val="ListNumber"/>
       </w:pPr>
       <w:r>
+        <w:rPr>
+          <w:rFonts w:eastAsia="Microsoft YaHei"/>
+        </w:rPr>
         <w:t>普通用户提交经销商申请，管理员审核通过；原会话进入门户并查看专属价格。</w:t>
       </w:r>
     </w:p>
@@ -12420,6 +14311,9 @@
         <w:pStyle w:val="ListNumber"/>
       </w:pPr>
       <w:r>
+        <w:rPr>
+          <w:rFonts w:eastAsia="Microsoft YaHei"/>
+        </w:rPr>
         <w:t>修改站点名称、联系信息和 Banner；刷新 Header、Footer、首页与联系页。</w:t>
       </w:r>
     </w:p>
@@ -12428,6 +14322,9 @@
         <w:pStyle w:val="ListNumber"/>
       </w:pPr>
       <w:r>
+        <w:rPr>
+          <w:rFonts w:eastAsia="Microsoft YaHei"/>
+        </w:rPr>
         <w:t>在 375px、768px、1280px 下逐页检查首页、产品、内容、支持、账户和后台。</w:t>
       </w:r>
     </w:p>
@@ -12436,6 +14333,9 @@
         <w:pStyle w:val="ListNumber"/>
       </w:pPr>
       <w:r>
+        <w:rPr>
+          <w:rFonts w:eastAsia="Microsoft YaHei"/>
+        </w:rPr>
         <w:t>重启 backend 与 mysql 后复查配置、Banner、留言、申请和用户状态。</w:t>
       </w:r>
     </w:p>
@@ -12444,11 +14344,17 @@
         <w:pStyle w:val="Heading2"/>
       </w:pPr>
       <w:r>
+        <w:rPr>
+          <w:rFonts w:eastAsia="Microsoft YaHei"/>
+        </w:rPr>
         <w:t>5.1 证据命名</w:t>
       </w:r>
     </w:p>
     <w:p>
       <w:r>
+        <w:rPr>
+          <w:rFonts w:eastAsia="Microsoft YaHei"/>
+        </w:rPr>
         <w:t>截图统一使用 用例编号 页面或动作 宽度 日期，例如 OPS-008 首页Banner 1280 20260909.png。失败时同时记录 requestId、HTTP 状态、复现步骤和修复提交。</w:t>
       </w:r>
     </w:p>
@@ -12457,12 +14363,95 @@
         <w:pStyle w:val="Heading1"/>
       </w:pPr>
       <w:r>
+        <w:rPr>
+          <w:rFonts w:eastAsia="Microsoft YaHei"/>
+        </w:rPr>
         <w:t>6 发布判定</w:t>
       </w:r>
     </w:p>
     <w:p>
       <w:r>
+        <w:rPr>
+          <w:rFonts w:eastAsia="Microsoft YaHei"/>
+        </w:rPr>
         <w:t>允许合并和部署的条件是：全部 P0 自动化用例通过，CI 三个作业为绿色，Compose 新卷初始化成功，关键业务闭环和三档响应式完成现场验收，且没有未关闭的 P0 或 P1 缺陷。Docker Hub 或外部网络故障应记录为环境阻塞，不得把未执行项标记为通过。</w:t>
+      </w:r>
+    </w:p>
+    <w:p>
+      <w:pPr>
+        <w:pStyle w:val="Heading2"/>
+        <w:spacing w:before="280"/>
+      </w:pPr>
+      <w:r>
+        <w:rPr>
+          <w:rFonts w:ascii="Aptos" w:hAnsi="Aptos" w:eastAsia="Microsoft YaHei"/>
+          <w:sz w:val="22"/>
+        </w:rPr>
+        <w:t>6.1 当前发布状态</w:t>
+      </w:r>
+    </w:p>
+    <w:p>
+      <w:pPr>
+        <w:spacing w:after="160"/>
+      </w:pPr>
+      <w:r>
+        <w:rPr>
+          <w:rFonts w:ascii="Aptos" w:hAnsi="Aptos" w:eastAsia="Microsoft YaHei"/>
+          <w:sz w:val="22"/>
+        </w:rPr>
+        <w:t>当前版本已满足本地功能和自动化验收条件；在功能分支 CI、三档现场响应式和公网部署完成前，不标记为正式发布。</w:t>
+      </w:r>
+    </w:p>
+    <w:p>
+      <w:pPr>
+        <w:pStyle w:val="ListBullet"/>
+        <w:spacing w:after="60"/>
+      </w:pPr>
+      <w:r>
+        <w:rPr>
+          <w:rFonts w:ascii="Aptos" w:hAnsi="Aptos" w:eastAsia="Microsoft YaHei"/>
+          <w:sz w:val="21"/>
+        </w:rPr>
+        <w:t>已完成：后端单元测试 86 项、真实 MySQL e2e 86 项、前端测试 8 项。</w:t>
+      </w:r>
+    </w:p>
+    <w:p>
+      <w:pPr>
+        <w:pStyle w:val="ListBullet"/>
+        <w:spacing w:after="60"/>
+      </w:pPr>
+      <w:r>
+        <w:rPr>
+          <w:rFonts w:ascii="Aptos" w:hAnsi="Aptos" w:eastAsia="Microsoft YaHei"/>
+          <w:sz w:val="21"/>
+        </w:rPr>
+        <w:t>已完成：前后端生产构建、Docker 镜像构建、Compose 三容器健康检查和 UTF-8 全库扫描。</w:t>
+      </w:r>
+    </w:p>
+    <w:p>
+      <w:pPr>
+        <w:pStyle w:val="ListBullet"/>
+        <w:spacing w:after="60"/>
+      </w:pPr>
+      <w:r>
+        <w:rPr>
+          <w:rFonts w:ascii="Aptos" w:hAnsi="Aptos" w:eastAsia="Microsoft YaHei"/>
+          <w:sz w:val="21"/>
+        </w:rPr>
+        <w:t>待完成：推送功能分支并确认 GitHub Actions 三个作业全部通过。</w:t>
+      </w:r>
+    </w:p>
+    <w:p>
+      <w:pPr>
+        <w:pStyle w:val="ListBullet"/>
+        <w:spacing w:after="60"/>
+      </w:pPr>
+      <w:r>
+        <w:rPr>
+          <w:rFonts w:ascii="Aptos" w:hAnsi="Aptos" w:eastAsia="Microsoft YaHei"/>
+          <w:sz w:val="21"/>
+        </w:rPr>
+        <w:t>待完成：补充 768px 现场截图；公网服务器需提供可达 IPv4 或可用 IPv6 出口后部署。</w:t>
       </w:r>
     </w:p>
     <w:sectPr>

</xml_diff>